<commit_message>
Journey: entry to saved reflections; Council: no "On track" without availability
- Journey app bar gets a "My reflections" action; the reflection history
  page existed but had no way in
- War Council headline says "No time added" instead of "On track" when the
  day has no availability, matching Today and the capacity tag
- Navigation tests for both (351 tests pass); user guide mentions the new entry
</commit_message>
<xml_diff>
--- a/docs/Balance_User_Guide.docx
+++ b/docs/Balance_User_Guide.docx
@@ -1278,7 +1278,7 @@
             <w:pPr>
               <w:spacing w:after="0"/>
             </w:pPr>
-            <w:hyperlink w:history="1" r:id="rIdrrkhtve_2ingzrp6no76e">
+            <w:hyperlink w:history="1" r:id="rId4rpatfjk6hfs-xqsvvgph">
               <w:r>
                 <w:rPr>
                   <w:rStyle w:val="Hyperlink"/>
@@ -2758,7 +2758,17 @@
         <w:t xml:space="preserve">Save</w:t>
       </w:r>
       <w:r>
-        <w:t xml:space="preserve">.</w:t>
+        <w:t xml:space="preserve">. The </w:t>
+      </w:r>
+      <w:r>
+        <w:rPr>
+          <w:b/>
+          <w:bCs/>
+        </w:rPr>
+        <w:t xml:space="preserve">My reflections</w:t>
+      </w:r>
+      <w:r>
+        <w:t xml:space="preserve"> icon (clock) at the top lists reflections from earlier weeks.</w:t>
       </w:r>
     </w:p>
     <w:p>

</xml_diff>

<commit_message>
Crash reporting with Sentry (errors only, opt-in via SENTRY_DSN)
- sentry_flutter 10 initialised only when the build supplies SENTRY_DSN;
  without it (tests, CI, teammates) Sentry is not started
- Privacy: no performance tracing, screenshots, IP address or user email
- Supabase start-up failures are reported before the friendly message
- Android minSdk raised to 26 (Android 8.0), required by sentry_flutter 10;
  user guide updated
- .env.example and README document SENTRY_DSN
</commit_message>
<xml_diff>
--- a/docs/Balance_User_Guide.docx
+++ b/docs/Balance_User_Guide.docx
@@ -1189,7 +1189,7 @@
                 <w:sz w:val="19"/>
                 <w:szCs w:val="19"/>
               </w:rPr>
-              <w:t xml:space="preserve">An Android phone (Android 7.0 or later) with internet</w:t>
+              <w:t xml:space="preserve">An Android phone (Android 8.0 or later) with internet</w:t>
             </w:r>
           </w:p>
         </w:tc>
@@ -1278,7 +1278,7 @@
             <w:pPr>
               <w:spacing w:after="0"/>
             </w:pPr>
-            <w:hyperlink w:history="1" r:id="rId4rpatfjk6hfs-xqsvvgph">
+            <w:hyperlink w:history="1" r:id="rIdvp_exak3pvufwtnjmcbsd">
               <w:r>
                 <w:rPr>
                   <w:rStyle w:val="Hyperlink"/>

</xml_diff>

<commit_message>
docs(user guide): introduction, Today order, task details, free-time suggestions, achievement wall, sound and alerts
Also states the sample date (1 Nov 2026), asks for Malaysia time on the
phone and adds troubleshooting for shifted times and missing sound.
</commit_message>
<xml_diff>
--- a/docs/Balance_User_Guide.docx
+++ b/docs/Balance_User_Guide.docx
@@ -24,7 +24,7 @@
         <w:t xml:space="preserve">Time needed:</w:t>
       </w:r>
       <w:r>
-        <w:t xml:space="preserve"> about 10 minutes. </w:t>
+        <w:t xml:space="preserve"> about 12 minutes. </w:t>
       </w:r>
       <w:r>
         <w:rPr>
@@ -58,10 +58,10 @@
         </w:tblBorders>
       </w:tblPr>
       <w:tblGrid>
-        <w:gridCol w:w="1255"/>
-        <w:gridCol w:w="1255"/>
-        <w:gridCol w:w="6138"/>
-        <w:gridCol w:w="1258"/>
+        <w:gridCol w:w="1024"/>
+        <w:gridCol w:w="1024"/>
+        <w:gridCol w:w="6831"/>
+        <w:gridCol w:w="1027"/>
       </w:tblGrid>
       <w:tr>
         <w:trPr>
@@ -69,7 +69,7 @@
         </w:trPr>
         <w:tc>
           <w:tcPr>
-            <w:tcW w:type="dxa" w:w="1255"/>
+            <w:tcW w:type="dxa" w:w="1024"/>
             <w:tcBorders>
               <w:top w:val="single" w:color="D9DBE6" w:sz="4"/>
               <w:left w:val="single" w:color="D9DBE6" w:sz="4"/>
@@ -102,7 +102,7 @@
         </w:tc>
         <w:tc>
           <w:tcPr>
-            <w:tcW w:type="dxa" w:w="1255"/>
+            <w:tcW w:type="dxa" w:w="1024"/>
             <w:tcBorders>
               <w:top w:val="single" w:color="D9DBE6" w:sz="4"/>
               <w:left w:val="single" w:color="D9DBE6" w:sz="4"/>
@@ -135,7 +135,7 @@
         </w:tc>
         <w:tc>
           <w:tcPr>
-            <w:tcW w:type="dxa" w:w="6138"/>
+            <w:tcW w:type="dxa" w:w="6831"/>
             <w:tcBorders>
               <w:top w:val="single" w:color="D9DBE6" w:sz="4"/>
               <w:left w:val="single" w:color="D9DBE6" w:sz="4"/>
@@ -168,7 +168,7 @@
         </w:tc>
         <w:tc>
           <w:tcPr>
-            <w:tcW w:type="dxa" w:w="1258"/>
+            <w:tcW w:type="dxa" w:w="1027"/>
             <w:tcBorders>
               <w:top w:val="single" w:color="D9DBE6" w:sz="4"/>
               <w:left w:val="single" w:color="D9DBE6" w:sz="4"/>
@@ -206,7 +206,7 @@
         </w:trPr>
         <w:tc>
           <w:tcPr>
-            <w:tcW w:type="dxa" w:w="1255"/>
+            <w:tcW w:type="dxa" w:w="1024"/>
             <w:tcBorders>
               <w:top w:val="single" w:color="D9DBE6" w:sz="4"/>
               <w:left w:val="single" w:color="D9DBE6" w:sz="4"/>
@@ -235,7 +235,7 @@
         </w:tc>
         <w:tc>
           <w:tcPr>
-            <w:tcW w:type="dxa" w:w="1255"/>
+            <w:tcW w:type="dxa" w:w="1024"/>
             <w:tcBorders>
               <w:top w:val="single" w:color="D9DBE6" w:sz="4"/>
               <w:left w:val="single" w:color="D9DBE6" w:sz="4"/>
@@ -264,36 +264,36 @@
         </w:tc>
         <w:tc>
           <w:tcPr>
-            <w:tcW w:type="dxa" w:w="6138"/>
-            <w:tcBorders>
-              <w:top w:val="single" w:color="D9DBE6" w:sz="4"/>
-              <w:left w:val="single" w:color="D9DBE6" w:sz="4"/>
-              <w:bottom w:val="single" w:color="D9DBE6" w:sz="4"/>
-              <w:right w:val="single" w:color="D9DBE6" w:sz="4"/>
-            </w:tcBorders>
-            <w:tcMar>
-              <w:top w:type="dxa" w:w="60"/>
-              <w:left w:type="dxa" w:w="100"/>
-              <w:bottom w:type="dxa" w:w="60"/>
-              <w:right w:type="dxa" w:w="100"/>
-            </w:tcMar>
-          </w:tcPr>
-          <w:p>
-            <w:pPr>
-              <w:spacing w:after="0"/>
-            </w:pPr>
-            <w:r>
-              <w:rPr>
-                <w:sz w:val="19"/>
-                <w:szCs w:val="19"/>
-              </w:rPr>
-              <w:t xml:space="preserve">Install the app and sign in</w:t>
-            </w:r>
-          </w:p>
-        </w:tc>
-        <w:tc>
-          <w:tcPr>
-            <w:tcW w:type="dxa" w:w="1258"/>
+            <w:tcW w:type="dxa" w:w="6831"/>
+            <w:tcBorders>
+              <w:top w:val="single" w:color="D9DBE6" w:sz="4"/>
+              <w:left w:val="single" w:color="D9DBE6" w:sz="4"/>
+              <w:bottom w:val="single" w:color="D9DBE6" w:sz="4"/>
+              <w:right w:val="single" w:color="D9DBE6" w:sz="4"/>
+            </w:tcBorders>
+            <w:tcMar>
+              <w:top w:type="dxa" w:w="60"/>
+              <w:left w:type="dxa" w:w="100"/>
+              <w:bottom w:type="dxa" w:w="60"/>
+              <w:right w:type="dxa" w:w="100"/>
+            </w:tcMar>
+          </w:tcPr>
+          <w:p>
+            <w:pPr>
+              <w:spacing w:after="0"/>
+            </w:pPr>
+            <w:r>
+              <w:rPr>
+                <w:sz w:val="19"/>
+                <w:szCs w:val="19"/>
+              </w:rPr>
+              <w:t xml:space="preserve">Install the app, sign in and read the short introduction</w:t>
+            </w:r>
+          </w:p>
+        </w:tc>
+        <w:tc>
+          <w:tcPr>
+            <w:tcW w:type="dxa" w:w="1027"/>
             <w:tcBorders>
               <w:top w:val="single" w:color="D9DBE6" w:sz="4"/>
               <w:left w:val="single" w:color="D9DBE6" w:sz="4"/>
@@ -327,7 +327,7 @@
         </w:trPr>
         <w:tc>
           <w:tcPr>
-            <w:tcW w:type="dxa" w:w="1255"/>
+            <w:tcW w:type="dxa" w:w="1024"/>
             <w:tcBorders>
               <w:top w:val="single" w:color="D9DBE6" w:sz="4"/>
               <w:left w:val="single" w:color="D9DBE6" w:sz="4"/>
@@ -357,7 +357,7 @@
         </w:tc>
         <w:tc>
           <w:tcPr>
-            <w:tcW w:type="dxa" w:w="1255"/>
+            <w:tcW w:type="dxa" w:w="1024"/>
             <w:tcBorders>
               <w:top w:val="single" w:color="D9DBE6" w:sz="4"/>
               <w:left w:val="single" w:color="D9DBE6" w:sz="4"/>
@@ -387,7 +387,7 @@
         </w:tc>
         <w:tc>
           <w:tcPr>
-            <w:tcW w:type="dxa" w:w="6138"/>
+            <w:tcW w:type="dxa" w:w="6831"/>
             <w:tcBorders>
               <w:top w:val="single" w:color="D9DBE6" w:sz="4"/>
               <w:left w:val="single" w:color="D9DBE6" w:sz="4"/>
@@ -411,13 +411,13 @@
                 <w:sz w:val="19"/>
                 <w:szCs w:val="19"/>
               </w:rPr>
-              <w:t xml:space="preserve">See a 2-hour overload and five workload bars</w:t>
-            </w:r>
-          </w:p>
-        </w:tc>
-        <w:tc>
-          <w:tcPr>
-            <w:tcW w:type="dxa" w:w="1258"/>
+              <w:t xml:space="preserve">See a 2-hour overload, the day's time and tasks, and five workload bars</w:t>
+            </w:r>
+          </w:p>
+        </w:tc>
+        <w:tc>
+          <w:tcPr>
+            <w:tcW w:type="dxa" w:w="1027"/>
             <w:tcBorders>
               <w:top w:val="single" w:color="D9DBE6" w:sz="4"/>
               <w:left w:val="single" w:color="D9DBE6" w:sz="4"/>
@@ -441,7 +441,7 @@
                 <w:sz w:val="19"/>
                 <w:szCs w:val="19"/>
               </w:rPr>
-              <w:t xml:space="preserve">1 min</w:t>
+              <w:t xml:space="preserve">2 min</w:t>
             </w:r>
           </w:p>
         </w:tc>
@@ -452,7 +452,7 @@
         </w:trPr>
         <w:tc>
           <w:tcPr>
-            <w:tcW w:type="dxa" w:w="1255"/>
+            <w:tcW w:type="dxa" w:w="1024"/>
             <w:tcBorders>
               <w:top w:val="single" w:color="D9DBE6" w:sz="4"/>
               <w:left w:val="single" w:color="D9DBE6" w:sz="4"/>
@@ -481,7 +481,7 @@
         </w:tc>
         <w:tc>
           <w:tcPr>
-            <w:tcW w:type="dxa" w:w="1255"/>
+            <w:tcW w:type="dxa" w:w="1024"/>
             <w:tcBorders>
               <w:top w:val="single" w:color="D9DBE6" w:sz="4"/>
               <w:left w:val="single" w:color="D9DBE6" w:sz="4"/>
@@ -510,36 +510,36 @@
         </w:tc>
         <w:tc>
           <w:tcPr>
-            <w:tcW w:type="dxa" w:w="6138"/>
-            <w:tcBorders>
-              <w:top w:val="single" w:color="D9DBE6" w:sz="4"/>
-              <w:left w:val="single" w:color="D9DBE6" w:sz="4"/>
-              <w:bottom w:val="single" w:color="D9DBE6" w:sz="4"/>
-              <w:right w:val="single" w:color="D9DBE6" w:sz="4"/>
-            </w:tcBorders>
-            <w:tcMar>
-              <w:top w:type="dxa" w:w="60"/>
-              <w:left w:type="dxa" w:w="100"/>
-              <w:bottom w:type="dxa" w:w="60"/>
-              <w:right w:type="dxa" w:w="100"/>
-            </w:tcMar>
-          </w:tcPr>
-          <w:p>
-            <w:pPr>
-              <w:spacing w:after="0"/>
-            </w:pPr>
-            <w:r>
-              <w:rPr>
-                <w:sz w:val="19"/>
-                <w:szCs w:val="19"/>
-              </w:rPr>
-              <w:t xml:space="preserve">Look at the two tasks behind the overload</w:t>
-            </w:r>
-          </w:p>
-        </w:tc>
-        <w:tc>
-          <w:tcPr>
-            <w:tcW w:type="dxa" w:w="1258"/>
+            <w:tcW w:type="dxa" w:w="6831"/>
+            <w:tcBorders>
+              <w:top w:val="single" w:color="D9DBE6" w:sz="4"/>
+              <w:left w:val="single" w:color="D9DBE6" w:sz="4"/>
+              <w:bottom w:val="single" w:color="D9DBE6" w:sz="4"/>
+              <w:right w:val="single" w:color="D9DBE6" w:sz="4"/>
+            </w:tcBorders>
+            <w:tcMar>
+              <w:top w:type="dxa" w:w="60"/>
+              <w:left w:type="dxa" w:w="100"/>
+              <w:bottom w:type="dxa" w:w="60"/>
+              <w:right w:type="dxa" w:w="100"/>
+            </w:tcMar>
+          </w:tcPr>
+          <w:p>
+            <w:pPr>
+              <w:spacing w:after="0"/>
+            </w:pPr>
+            <w:r>
+              <w:rPr>
+                <w:sz w:val="19"/>
+                <w:szCs w:val="19"/>
+              </w:rPr>
+              <w:t xml:space="preserve">Open the two tasks behind the overload</w:t>
+            </w:r>
+          </w:p>
+        </w:tc>
+        <w:tc>
+          <w:tcPr>
+            <w:tcW w:type="dxa" w:w="1027"/>
             <w:tcBorders>
               <w:top w:val="single" w:color="D9DBE6" w:sz="4"/>
               <w:left w:val="single" w:color="D9DBE6" w:sz="4"/>
@@ -573,7 +573,7 @@
         </w:trPr>
         <w:tc>
           <w:tcPr>
-            <w:tcW w:type="dxa" w:w="1255"/>
+            <w:tcW w:type="dxa" w:w="1024"/>
             <w:tcBorders>
               <w:top w:val="single" w:color="D9DBE6" w:sz="4"/>
               <w:left w:val="single" w:color="D9DBE6" w:sz="4"/>
@@ -603,7 +603,7 @@
         </w:tc>
         <w:tc>
           <w:tcPr>
-            <w:tcW w:type="dxa" w:w="1255"/>
+            <w:tcW w:type="dxa" w:w="1024"/>
             <w:tcBorders>
               <w:top w:val="single" w:color="D9DBE6" w:sz="4"/>
               <w:left w:val="single" w:color="D9DBE6" w:sz="4"/>
@@ -633,7 +633,7 @@
         </w:tc>
         <w:tc>
           <w:tcPr>
-            <w:tcW w:type="dxa" w:w="6138"/>
+            <w:tcW w:type="dxa" w:w="6831"/>
             <w:tcBorders>
               <w:top w:val="single" w:color="D9DBE6" w:sz="4"/>
               <w:left w:val="single" w:color="D9DBE6" w:sz="4"/>
@@ -663,7 +663,7 @@
         </w:tc>
         <w:tc>
           <w:tcPr>
-            <w:tcW w:type="dxa" w:w="1258"/>
+            <w:tcW w:type="dxa" w:w="1027"/>
             <w:tcBorders>
               <w:top w:val="single" w:color="D9DBE6" w:sz="4"/>
               <w:left w:val="single" w:color="D9DBE6" w:sz="4"/>
@@ -698,7 +698,7 @@
         </w:trPr>
         <w:tc>
           <w:tcPr>
-            <w:tcW w:type="dxa" w:w="1255"/>
+            <w:tcW w:type="dxa" w:w="1024"/>
             <w:tcBorders>
               <w:top w:val="single" w:color="D9DBE6" w:sz="4"/>
               <w:left w:val="single" w:color="D9DBE6" w:sz="4"/>
@@ -727,7 +727,7 @@
         </w:tc>
         <w:tc>
           <w:tcPr>
-            <w:tcW w:type="dxa" w:w="1255"/>
+            <w:tcW w:type="dxa" w:w="1024"/>
             <w:tcBorders>
               <w:top w:val="single" w:color="D9DBE6" w:sz="4"/>
               <w:left w:val="single" w:color="D9DBE6" w:sz="4"/>
@@ -756,7 +756,7 @@
         </w:tc>
         <w:tc>
           <w:tcPr>
-            <w:tcW w:type="dxa" w:w="6138"/>
+            <w:tcW w:type="dxa" w:w="6831"/>
             <w:tcBorders>
               <w:top w:val="single" w:color="D9DBE6" w:sz="4"/>
               <w:left w:val="single" w:color="D9DBE6" w:sz="4"/>
@@ -785,7 +785,7 @@
         </w:tc>
         <w:tc>
           <w:tcPr>
-            <w:tcW w:type="dxa" w:w="1258"/>
+            <w:tcW w:type="dxa" w:w="1027"/>
             <w:tcBorders>
               <w:top w:val="single" w:color="D9DBE6" w:sz="4"/>
               <w:left w:val="single" w:color="D9DBE6" w:sz="4"/>
@@ -819,7 +819,7 @@
         </w:trPr>
         <w:tc>
           <w:tcPr>
-            <w:tcW w:type="dxa" w:w="1255"/>
+            <w:tcW w:type="dxa" w:w="1024"/>
             <w:tcBorders>
               <w:top w:val="single" w:color="D9DBE6" w:sz="4"/>
               <w:left w:val="single" w:color="D9DBE6" w:sz="4"/>
@@ -849,7 +849,7 @@
         </w:tc>
         <w:tc>
           <w:tcPr>
-            <w:tcW w:type="dxa" w:w="1255"/>
+            <w:tcW w:type="dxa" w:w="1024"/>
             <w:tcBorders>
               <w:top w:val="single" w:color="D9DBE6" w:sz="4"/>
               <w:left w:val="single" w:color="D9DBE6" w:sz="4"/>
@@ -879,7 +879,7 @@
         </w:tc>
         <w:tc>
           <w:tcPr>
-            <w:tcW w:type="dxa" w:w="6138"/>
+            <w:tcW w:type="dxa" w:w="6831"/>
             <w:tcBorders>
               <w:top w:val="single" w:color="D9DBE6" w:sz="4"/>
               <w:left w:val="single" w:color="D9DBE6" w:sz="4"/>
@@ -903,13 +903,13 @@
                 <w:sz w:val="19"/>
                 <w:szCs w:val="19"/>
               </w:rPr>
-              <w:t xml:space="preserve">Protect 30 minutes of rest, then remove it</w:t>
-            </w:r>
-          </w:p>
-        </w:tc>
-        <w:tc>
-          <w:tcPr>
-            <w:tcW w:type="dxa" w:w="1258"/>
+              <w:t xml:space="preserve">Protect 30 minutes of rest from a suggested free time, then remove it</w:t>
+            </w:r>
+          </w:p>
+        </w:tc>
+        <w:tc>
+          <w:tcPr>
+            <w:tcW w:type="dxa" w:w="1027"/>
             <w:tcBorders>
               <w:top w:val="single" w:color="D9DBE6" w:sz="4"/>
               <w:left w:val="single" w:color="D9DBE6" w:sz="4"/>
@@ -944,7 +944,7 @@
         </w:trPr>
         <w:tc>
           <w:tcPr>
-            <w:tcW w:type="dxa" w:w="1255"/>
+            <w:tcW w:type="dxa" w:w="1024"/>
             <w:tcBorders>
               <w:top w:val="single" w:color="D9DBE6" w:sz="4"/>
               <w:left w:val="single" w:color="D9DBE6" w:sz="4"/>
@@ -973,7 +973,7 @@
         </w:tc>
         <w:tc>
           <w:tcPr>
-            <w:tcW w:type="dxa" w:w="1255"/>
+            <w:tcW w:type="dxa" w:w="1024"/>
             <w:tcBorders>
               <w:top w:val="single" w:color="D9DBE6" w:sz="4"/>
               <w:left w:val="single" w:color="D9DBE6" w:sz="4"/>
@@ -1002,42 +1002,167 @@
         </w:tc>
         <w:tc>
           <w:tcPr>
-            <w:tcW w:type="dxa" w:w="6138"/>
-            <w:tcBorders>
-              <w:top w:val="single" w:color="D9DBE6" w:sz="4"/>
-              <w:left w:val="single" w:color="D9DBE6" w:sz="4"/>
-              <w:bottom w:val="single" w:color="D9DBE6" w:sz="4"/>
-              <w:right w:val="single" w:color="D9DBE6" w:sz="4"/>
-            </w:tcBorders>
-            <w:tcMar>
-              <w:top w:type="dxa" w:w="60"/>
-              <w:left w:type="dxa" w:w="100"/>
-              <w:bottom w:type="dxa" w:w="60"/>
-              <w:right w:type="dxa" w:w="100"/>
-            </w:tcMar>
-          </w:tcPr>
-          <w:p>
-            <w:pPr>
-              <w:spacing w:after="0"/>
-            </w:pPr>
-            <w:r>
-              <w:rPr>
-                <w:sz w:val="19"/>
-                <w:szCs w:val="19"/>
-              </w:rPr>
-              <w:t xml:space="preserve">Read the weekly summary and achievements</w:t>
-            </w:r>
-          </w:p>
-        </w:tc>
-        <w:tc>
-          <w:tcPr>
-            <w:tcW w:type="dxa" w:w="1258"/>
-            <w:tcBorders>
-              <w:top w:val="single" w:color="D9DBE6" w:sz="4"/>
-              <w:left w:val="single" w:color="D9DBE6" w:sz="4"/>
-              <w:bottom w:val="single" w:color="D9DBE6" w:sz="4"/>
-              <w:right w:val="single" w:color="D9DBE6" w:sz="4"/>
-            </w:tcBorders>
+            <w:tcW w:type="dxa" w:w="6831"/>
+            <w:tcBorders>
+              <w:top w:val="single" w:color="D9DBE6" w:sz="4"/>
+              <w:left w:val="single" w:color="D9DBE6" w:sz="4"/>
+              <w:bottom w:val="single" w:color="D9DBE6" w:sz="4"/>
+              <w:right w:val="single" w:color="D9DBE6" w:sz="4"/>
+            </w:tcBorders>
+            <w:tcMar>
+              <w:top w:type="dxa" w:w="60"/>
+              <w:left w:type="dxa" w:w="100"/>
+              <w:bottom w:type="dxa" w:w="60"/>
+              <w:right w:type="dxa" w:w="100"/>
+            </w:tcMar>
+          </w:tcPr>
+          <w:p>
+            <w:pPr>
+              <w:spacing w:after="0"/>
+            </w:pPr>
+            <w:r>
+              <w:rPr>
+                <w:sz w:val="19"/>
+                <w:szCs w:val="19"/>
+              </w:rPr>
+              <w:t xml:space="preserve">Read the weekly summary and the achievement wall</w:t>
+            </w:r>
+          </w:p>
+        </w:tc>
+        <w:tc>
+          <w:tcPr>
+            <w:tcW w:type="dxa" w:w="1027"/>
+            <w:tcBorders>
+              <w:top w:val="single" w:color="D9DBE6" w:sz="4"/>
+              <w:left w:val="single" w:color="D9DBE6" w:sz="4"/>
+              <w:bottom w:val="single" w:color="D9DBE6" w:sz="4"/>
+              <w:right w:val="single" w:color="D9DBE6" w:sz="4"/>
+            </w:tcBorders>
+            <w:tcMar>
+              <w:top w:type="dxa" w:w="60"/>
+              <w:left w:type="dxa" w:w="100"/>
+              <w:bottom w:type="dxa" w:w="60"/>
+              <w:right w:type="dxa" w:w="100"/>
+            </w:tcMar>
+          </w:tcPr>
+          <w:p>
+            <w:pPr>
+              <w:spacing w:after="0"/>
+            </w:pPr>
+            <w:r>
+              <w:rPr>
+                <w:sz w:val="19"/>
+                <w:szCs w:val="19"/>
+              </w:rPr>
+              <w:t xml:space="preserve">1 min</w:t>
+            </w:r>
+          </w:p>
+        </w:tc>
+      </w:tr>
+      <w:tr>
+        <w:trPr>
+          <w:cantSplit/>
+        </w:trPr>
+        <w:tc>
+          <w:tcPr>
+            <w:tcW w:type="dxa" w:w="1024"/>
+            <w:tcBorders>
+              <w:top w:val="single" w:color="D9DBE6" w:sz="4"/>
+              <w:left w:val="single" w:color="D9DBE6" w:sz="4"/>
+              <w:bottom w:val="single" w:color="D9DBE6" w:sz="4"/>
+              <w:right w:val="single" w:color="D9DBE6" w:sz="4"/>
+            </w:tcBorders>
+            <w:shd w:fill="F5F5FA" w:val="clear"/>
+            <w:tcMar>
+              <w:top w:type="dxa" w:w="60"/>
+              <w:left w:type="dxa" w:w="100"/>
+              <w:bottom w:type="dxa" w:w="60"/>
+              <w:right w:type="dxa" w:w="100"/>
+            </w:tcMar>
+          </w:tcPr>
+          <w:p>
+            <w:pPr>
+              <w:spacing w:after="0"/>
+            </w:pPr>
+            <w:r>
+              <w:rPr>
+                <w:sz w:val="19"/>
+                <w:szCs w:val="19"/>
+              </w:rPr>
+              <w:t xml:space="preserve">8</w:t>
+            </w:r>
+          </w:p>
+        </w:tc>
+        <w:tc>
+          <w:tcPr>
+            <w:tcW w:type="dxa" w:w="1024"/>
+            <w:tcBorders>
+              <w:top w:val="single" w:color="D9DBE6" w:sz="4"/>
+              <w:left w:val="single" w:color="D9DBE6" w:sz="4"/>
+              <w:bottom w:val="single" w:color="D9DBE6" w:sz="4"/>
+              <w:right w:val="single" w:color="D9DBE6" w:sz="4"/>
+            </w:tcBorders>
+            <w:shd w:fill="F5F5FA" w:val="clear"/>
+            <w:tcMar>
+              <w:top w:type="dxa" w:w="60"/>
+              <w:left w:type="dxa" w:w="100"/>
+              <w:bottom w:type="dxa" w:w="60"/>
+              <w:right w:type="dxa" w:w="100"/>
+            </w:tcMar>
+          </w:tcPr>
+          <w:p>
+            <w:pPr>
+              <w:spacing w:after="0"/>
+            </w:pPr>
+            <w:r>
+              <w:rPr>
+                <w:sz w:val="19"/>
+                <w:szCs w:val="19"/>
+              </w:rPr>
+              <w:t xml:space="preserve">PROFILE</w:t>
+            </w:r>
+          </w:p>
+        </w:tc>
+        <w:tc>
+          <w:tcPr>
+            <w:tcW w:type="dxa" w:w="6831"/>
+            <w:tcBorders>
+              <w:top w:val="single" w:color="D9DBE6" w:sz="4"/>
+              <w:left w:val="single" w:color="D9DBE6" w:sz="4"/>
+              <w:bottom w:val="single" w:color="D9DBE6" w:sz="4"/>
+              <w:right w:val="single" w:color="D9DBE6" w:sz="4"/>
+            </w:tcBorders>
+            <w:shd w:fill="F5F5FA" w:val="clear"/>
+            <w:tcMar>
+              <w:top w:type="dxa" w:w="60"/>
+              <w:left w:type="dxa" w:w="100"/>
+              <w:bottom w:type="dxa" w:w="60"/>
+              <w:right w:type="dxa" w:w="100"/>
+            </w:tcMar>
+          </w:tcPr>
+          <w:p>
+            <w:pPr>
+              <w:spacing w:after="0"/>
+            </w:pPr>
+            <w:r>
+              <w:rPr>
+                <w:sz w:val="19"/>
+                <w:szCs w:val="19"/>
+              </w:rPr>
+              <w:t xml:space="preserve">Optional: sound, reminders and overload alerts</w:t>
+            </w:r>
+          </w:p>
+        </w:tc>
+        <w:tc>
+          <w:tcPr>
+            <w:tcW w:type="dxa" w:w="1027"/>
+            <w:tcBorders>
+              <w:top w:val="single" w:color="D9DBE6" w:sz="4"/>
+              <w:left w:val="single" w:color="D9DBE6" w:sz="4"/>
+              <w:bottom w:val="single" w:color="D9DBE6" w:sz="4"/>
+              <w:right w:val="single" w:color="D9DBE6" w:sz="4"/>
+            </w:tcBorders>
+            <w:shd w:fill="F5F5FA" w:val="clear"/>
             <w:tcMar>
               <w:top w:type="dxa" w:w="60"/>
               <w:left w:type="dxa" w:w="100"/>
@@ -1086,8 +1211,8 @@
         </w:tblBorders>
       </w:tblPr>
       <w:tblGrid>
-        <w:gridCol w:w="4646"/>
-        <w:gridCol w:w="5260"/>
+        <w:gridCol w:w="4953"/>
+        <w:gridCol w:w="4953"/>
       </w:tblGrid>
       <w:tr>
         <w:trPr>
@@ -1095,7 +1220,7 @@
         </w:trPr>
         <w:tc>
           <w:tcPr>
-            <w:tcW w:type="dxa" w:w="4646"/>
+            <w:tcW w:type="dxa" w:w="4953"/>
             <w:tcBorders>
               <w:top w:val="single" w:color="D9DBE6" w:sz="4"/>
               <w:left w:val="single" w:color="D9DBE6" w:sz="4"/>
@@ -1128,7 +1253,7 @@
         </w:tc>
         <w:tc>
           <w:tcPr>
-            <w:tcW w:type="dxa" w:w="5260"/>
+            <w:tcW w:type="dxa" w:w="4953"/>
             <w:tcBorders>
               <w:top w:val="single" w:color="D9DBE6" w:sz="4"/>
               <w:left w:val="single" w:color="D9DBE6" w:sz="4"/>
@@ -1166,36 +1291,45 @@
         </w:trPr>
         <w:tc>
           <w:tcPr>
-            <w:tcW w:type="dxa" w:w="4646"/>
-            <w:tcBorders>
-              <w:top w:val="single" w:color="D9DBE6" w:sz="4"/>
-              <w:left w:val="single" w:color="D9DBE6" w:sz="4"/>
-              <w:bottom w:val="single" w:color="D9DBE6" w:sz="4"/>
-              <w:right w:val="single" w:color="D9DBE6" w:sz="4"/>
-            </w:tcBorders>
-            <w:tcMar>
-              <w:top w:type="dxa" w:w="60"/>
-              <w:left w:type="dxa" w:w="100"/>
-              <w:bottom w:type="dxa" w:w="60"/>
-              <w:right w:type="dxa" w:w="100"/>
-            </w:tcMar>
-          </w:tcPr>
-          <w:p>
-            <w:pPr>
-              <w:spacing w:after="0"/>
-            </w:pPr>
-            <w:r>
-              <w:rPr>
-                <w:sz w:val="19"/>
-                <w:szCs w:val="19"/>
-              </w:rPr>
-              <w:t xml:space="preserve">An Android phone (Android 8.0 or later) with internet</w:t>
-            </w:r>
-          </w:p>
-        </w:tc>
-        <w:tc>
-          <w:tcPr>
-            <w:tcW w:type="dxa" w:w="5260"/>
+            <w:tcW w:type="dxa" w:w="4953"/>
+            <w:tcBorders>
+              <w:top w:val="single" w:color="D9DBE6" w:sz="4"/>
+              <w:left w:val="single" w:color="D9DBE6" w:sz="4"/>
+              <w:bottom w:val="single" w:color="D9DBE6" w:sz="4"/>
+              <w:right w:val="single" w:color="D9DBE6" w:sz="4"/>
+            </w:tcBorders>
+            <w:tcMar>
+              <w:top w:type="dxa" w:w="60"/>
+              <w:left w:type="dxa" w:w="100"/>
+              <w:bottom w:type="dxa" w:w="60"/>
+              <w:right w:type="dxa" w:w="100"/>
+            </w:tcMar>
+          </w:tcPr>
+          <w:p>
+            <w:pPr>
+              <w:spacing w:after="0"/>
+            </w:pPr>
+            <w:r>
+              <w:rPr>
+                <w:sz w:val="19"/>
+                <w:szCs w:val="19"/>
+              </w:rPr>
+              <w:t xml:space="preserve">An Android phone (Android 8.0 or later) with internet, set to </w:t>
+            </w:r>
+            <w:r>
+              <w:rPr>
+                <w:b/>
+                <w:bCs/>
+                <w:sz w:val="19"/>
+                <w:szCs w:val="19"/>
+              </w:rPr>
+              <w:t xml:space="preserve">Malaysia time</w:t>
+            </w:r>
+          </w:p>
+        </w:tc>
+        <w:tc>
+          <w:tcPr>
+            <w:tcW w:type="dxa" w:w="4953"/>
             <w:tcBorders>
               <w:top w:val="single" w:color="D9DBE6" w:sz="4"/>
               <w:left w:val="single" w:color="D9DBE6" w:sz="4"/>
@@ -1229,7 +1363,7 @@
         </w:trPr>
         <w:tc>
           <w:tcPr>
-            <w:tcW w:type="dxa" w:w="4646"/>
+            <w:tcW w:type="dxa" w:w="4953"/>
             <w:tcBorders>
               <w:top w:val="single" w:color="D9DBE6" w:sz="4"/>
               <w:left w:val="single" w:color="D9DBE6" w:sz="4"/>
@@ -1259,7 +1393,7 @@
         </w:tc>
         <w:tc>
           <w:tcPr>
-            <w:tcW w:type="dxa" w:w="5260"/>
+            <w:tcW w:type="dxa" w:w="4953"/>
             <w:tcBorders>
               <w:top w:val="single" w:color="D9DBE6" w:sz="4"/>
               <w:left w:val="single" w:color="D9DBE6" w:sz="4"/>
@@ -1278,7 +1412,7 @@
             <w:pPr>
               <w:spacing w:after="0"/>
             </w:pPr>
-            <w:hyperlink w:history="1" r:id="rIdvp_exak3pvufwtnjmcbsd">
+            <w:hyperlink w:history="1" r:id="rId9yqrak7oxtw3h7xcam8my">
               <w:r>
                 <w:rPr>
                   <w:rStyle w:val="Hyperlink"/>
@@ -1313,7 +1447,7 @@
         </w:trPr>
         <w:tc>
           <w:tcPr>
-            <w:tcW w:type="dxa" w:w="4646"/>
+            <w:tcW w:type="dxa" w:w="4953"/>
             <w:tcBorders>
               <w:top w:val="single" w:color="D9DBE6" w:sz="4"/>
               <w:left w:val="single" w:color="D9DBE6" w:sz="4"/>
@@ -1342,7 +1476,7 @@
         </w:tc>
         <w:tc>
           <w:tcPr>
-            <w:tcW w:type="dxa" w:w="5260"/>
+            <w:tcW w:type="dxa" w:w="4953"/>
             <w:tcBorders>
               <w:top w:val="single" w:color="D9DBE6" w:sz="4"/>
               <w:left w:val="single" w:color="D9DBE6" w:sz="4"/>
@@ -1376,7 +1510,7 @@
         </w:trPr>
         <w:tc>
           <w:tcPr>
-            <w:tcW w:type="dxa" w:w="4646"/>
+            <w:tcW w:type="dxa" w:w="4953"/>
             <w:tcBorders>
               <w:top w:val="single" w:color="D9DBE6" w:sz="4"/>
               <w:left w:val="single" w:color="D9DBE6" w:sz="4"/>
@@ -1415,7 +1549,7 @@
         </w:tc>
         <w:tc>
           <w:tcPr>
-            <w:tcW w:type="dxa" w:w="5260"/>
+            <w:tcW w:type="dxa" w:w="4953"/>
             <w:tcBorders>
               <w:top w:val="single" w:color="D9DBE6" w:sz="4"/>
               <w:left w:val="single" w:color="D9DBE6" w:sz="4"/>
@@ -1436,10 +1570,19 @@
             </w:pPr>
             <w:r>
               <w:rPr>
-                <w:sz w:val="19"/>
-                <w:szCs w:val="19"/>
-              </w:rPr>
-              <w:t xml:space="preserve">In our submission form, next to the account details.</w:t>
+                <w:b/>
+                <w:bCs/>
+                <w:sz w:val="19"/>
+                <w:szCs w:val="19"/>
+              </w:rPr>
+              <w:t xml:space="preserve">Sunday 1 November 2026</w:t>
+            </w:r>
+            <w:r>
+              <w:rPr>
+                <w:sz w:val="19"/>
+                <w:szCs w:val="19"/>
+              </w:rPr>
+              <w:t xml:space="preserve"> (also in our submission form).</w:t>
             </w:r>
           </w:p>
         </w:tc>
@@ -1472,7 +1615,7 @@
         <w:t xml:space="preserve">Workload Overview · World Status</w:t>
       </w:r>
       <w:r>
-        <w:t xml:space="preserve">.</w:t>
+        <w:t xml:space="preserve">. Your profile is the round icon at the top right.</w:t>
       </w:r>
     </w:p>
     <w:p>
@@ -1563,8 +1706,81 @@
       </w:r>
     </w:p>
     <w:p>
-      <w:r>
-        <w:t xml:space="preserve">You should see the </w:t>
+      <w:pPr>
+        <w:pStyle w:val="ListParagraph"/>
+        <w:numPr>
+          <w:ilvl w:val="0"/>
+          <w:numId w:val="2"/>
+        </w:numPr>
+        <w:spacing w:after="50"/>
+      </w:pPr>
+      <w:r>
+        <w:t xml:space="preserve">A three-page introduction appears the first time: </w:t>
+      </w:r>
+      <w:r>
+        <w:rPr>
+          <w:b/>
+          <w:bCs/>
+        </w:rPr>
+        <w:t xml:space="preserve">Detect</w:t>
+      </w:r>
+      <w:r>
+        <w:t xml:space="preserve">, </w:t>
+      </w:r>
+      <w:r>
+        <w:rPr>
+          <w:b/>
+          <w:bCs/>
+        </w:rPr>
+        <w:t xml:space="preserve">Decide</w:t>
+      </w:r>
+      <w:r>
+        <w:t xml:space="preserve">, </w:t>
+      </w:r>
+      <w:r>
+        <w:rPr>
+          <w:b/>
+          <w:bCs/>
+        </w:rPr>
+        <w:t xml:space="preserve">Recover and reflect</w:t>
+      </w:r>
+      <w:r>
+        <w:t xml:space="preserve">. Tap </w:t>
+      </w:r>
+      <w:r>
+        <w:rPr>
+          <w:b/>
+          <w:bCs/>
+        </w:rPr>
+        <w:t xml:space="preserve">Next</w:t>
+      </w:r>
+      <w:r>
+        <w:t xml:space="preserve">, or </w:t>
+      </w:r>
+      <w:r>
+        <w:rPr>
+          <w:b/>
+          <w:bCs/>
+        </w:rPr>
+        <w:t xml:space="preserve">Skip</w:t>
+      </w:r>
+      <w:r>
+        <w:t xml:space="preserve"> at any time. You can reopen it later in </w:t>
+      </w:r>
+      <w:r>
+        <w:rPr>
+          <w:b/>
+          <w:bCs/>
+        </w:rPr>
+        <w:t xml:space="preserve">Profile → How Balance works</w:t>
+      </w:r>
+      <w:r>
+        <w:t xml:space="preserve">.</w:t>
+      </w:r>
+    </w:p>
+    <w:p>
+      <w:r>
+        <w:t xml:space="preserve">You should then see the </w:t>
       </w:r>
       <w:r>
         <w:rPr>
@@ -1583,6 +1799,11 @@
       </w:pPr>
       <w:r>
         <w:t xml:space="preserve">2. See the overload (TODAY)</w:t>
+      </w:r>
+    </w:p>
+    <w:p>
+      <w:r>
+        <w:t xml:space="preserve">Today shows what matters first: whether the day fits, then the time and work behind it.</w:t>
       </w:r>
     </w:p>
     <w:p>
@@ -1595,7 +1816,7 @@
         <w:spacing w:after="50"/>
       </w:pPr>
       <w:r>
-        <w:t xml:space="preserve">Use the </w:t>
+        <w:t xml:space="preserve">If today is not the sample date, use the </w:t>
       </w:r>
       <w:r>
         <w:rPr>
@@ -1605,17 +1826,7 @@
         <w:t xml:space="preserve">Previous day / Next day</w:t>
       </w:r>
       <w:r>
-        <w:t xml:space="preserve"> arrows to open the </w:t>
-      </w:r>
-      <w:r>
-        <w:rPr>
-          <w:b/>
-          <w:bCs/>
-        </w:rPr>
-        <w:t xml:space="preserve">sample date</w:t>
-      </w:r>
-      <w:r>
-        <w:t xml:space="preserve">.</w:t>
+        <w:t xml:space="preserve"> arrows to open it.</w:t>
       </w:r>
     </w:p>
     <w:p>
@@ -1658,7 +1869,7 @@
         <w:t xml:space="preserve">3h available</w:t>
       </w:r>
       <w:r>
-        <w:t xml:space="preserve"> (09:00–12:00) and a red </w:t>
+        <w:t xml:space="preserve"> and a red </w:t>
       </w:r>
       <w:r>
         <w:rPr>
@@ -1668,7 +1879,17 @@
         <w:t xml:space="preserve">2h over</w:t>
       </w:r>
       <w:r>
-        <w:t xml:space="preserve"> tag. The planned work does not fit.</w:t>
+        <w:t xml:space="preserve"> tag. Below it, </w:t>
+      </w:r>
+      <w:r>
+        <w:rPr>
+          <w:b/>
+          <w:bCs/>
+        </w:rPr>
+        <w:t xml:space="preserve">Capacity gap</w:t>
+      </w:r>
+      <w:r>
+        <w:t xml:space="preserve"> says 120 minutes must be moved, reduced or recovered.</w:t>
       </w:r>
     </w:p>
     <w:p>
@@ -1681,37 +1902,44 @@
         <w:spacing w:after="50"/>
       </w:pPr>
       <w:r>
-        <w:t xml:space="preserve">The </w:t>
-      </w:r>
-      <w:r>
-        <w:rPr>
-          <w:b/>
-          <w:bCs/>
-        </w:rPr>
-        <w:t xml:space="preserve">World Status</w:t>
-      </w:r>
-      <w:r>
-        <w:t xml:space="preserve"> card shows five bars in a fixed order: </w:t>
-      </w:r>
-      <w:r>
-        <w:rPr>
-          <w:b/>
-          <w:bCs/>
-        </w:rPr>
-        <w:t xml:space="preserve">Mental, Time, Physical, Social, Errands</w:t>
-      </w:r>
-      <w:r>
-        <w:t xml:space="preserve">. Bars without enough data say </w:t>
-      </w:r>
-      <w:r>
-        <w:rPr>
-          <w:b/>
-          <w:bCs/>
-        </w:rPr>
-        <w:t xml:space="preserve">Unknown</w:t>
-      </w:r>
-      <w:r>
-        <w:t xml:space="preserve">. Balance never treats missing data as zero or guesses it.</w:t>
+        <w:rPr>
+          <w:b/>
+          <w:bCs/>
+        </w:rPr>
+        <w:t xml:space="preserve">Availability</w:t>
+      </w:r>
+      <w:r>
+        <w:t xml:space="preserve"> shows the free time: </w:t>
+      </w:r>
+      <w:r>
+        <w:rPr>
+          <w:b/>
+          <w:bCs/>
+        </w:rPr>
+        <w:t xml:space="preserve">9:00 AM – 12:00 PM</w:t>
+      </w:r>
+      <w:r>
+        <w:t xml:space="preserve">. Under it, </w:t>
+      </w:r>
+      <w:r>
+        <w:rPr>
+          <w:b/>
+          <w:bCs/>
+        </w:rPr>
+        <w:t xml:space="preserve">Repeat for the next 6 days</w:t>
+      </w:r>
+      <w:r>
+        <w:t xml:space="preserve"> copies a day's time to the coming days, and an empty day offers </w:t>
+      </w:r>
+      <w:r>
+        <w:rPr>
+          <w:b/>
+          <w:bCs/>
+        </w:rPr>
+        <w:t xml:space="preserve">Copy from</w:t>
+      </w:r>
+      <w:r>
+        <w:t xml:space="preserve"> the previous day. On this shared judge account, please only look at these buttons, so the sample week stays the same for every judge.</w:t>
       </w:r>
     </w:p>
     <w:p>
@@ -1724,27 +1952,133 @@
         <w:spacing w:after="50"/>
       </w:pPr>
       <w:r>
-        <w:t xml:space="preserve">Optional: the daily review asks for energy and hours of rest. Tap </w:t>
-      </w:r>
-      <w:r>
-        <w:rPr>
-          <w:b/>
-          <w:bCs/>
-        </w:rPr>
-        <w:t xml:space="preserve">Save review</w:t>
-      </w:r>
-      <w:r>
-        <w:t xml:space="preserve"> or </w:t>
-      </w:r>
-      <w:r>
-        <w:rPr>
-          <w:b/>
-          <w:bCs/>
-        </w:rPr>
-        <w:t xml:space="preserve">Skip for now</w:t>
-      </w:r>
-      <w:r>
-        <w:t xml:space="preserve">. Skipping has no penalty.</w:t>
+        <w:rPr>
+          <w:b/>
+          <w:bCs/>
+        </w:rPr>
+        <w:t xml:space="preserve">Planned tasks</w:t>
+      </w:r>
+      <w:r>
+        <w:t xml:space="preserve"> lists the two tasks. Tap one to see why it counts on this day.</w:t>
+      </w:r>
+    </w:p>
+    <w:p>
+      <w:pPr>
+        <w:pStyle w:val="ListParagraph"/>
+        <w:numPr>
+          <w:ilvl w:val="0"/>
+          <w:numId w:val="3"/>
+        </w:numPr>
+        <w:spacing w:after="50"/>
+      </w:pPr>
+      <w:r>
+        <w:t xml:space="preserve">Scroll to </w:t>
+      </w:r>
+      <w:r>
+        <w:rPr>
+          <w:b/>
+          <w:bCs/>
+        </w:rPr>
+        <w:t xml:space="preserve">Workload Overview · World Status</w:t>
+      </w:r>
+      <w:r>
+        <w:t xml:space="preserve">: five bars in a fixed order, </w:t>
+      </w:r>
+      <w:r>
+        <w:rPr>
+          <w:b/>
+          <w:bCs/>
+        </w:rPr>
+        <w:t xml:space="preserve">Mental, Time, Physical, Social, Errands</w:t>
+      </w:r>
+      <w:r>
+        <w:t xml:space="preserve">. Bars without enough data say </w:t>
+      </w:r>
+      <w:r>
+        <w:rPr>
+          <w:b/>
+          <w:bCs/>
+        </w:rPr>
+        <w:t xml:space="preserve">Unknown</w:t>
+      </w:r>
+      <w:r>
+        <w:t xml:space="preserve">; Balance never treats missing data as zero. When the previous day also has a record, each bar shows its change since yesterday (</w:t>
+      </w:r>
+      <w:r>
+        <w:rPr>
+          <w:b/>
+          <w:bCs/>
+        </w:rPr>
+        <w:t xml:space="preserve">▲</w:t>
+      </w:r>
+      <w:r>
+        <w:t xml:space="preserve"> more pressure, </w:t>
+      </w:r>
+      <w:r>
+        <w:rPr>
+          <w:b/>
+          <w:bCs/>
+        </w:rPr>
+        <w:t xml:space="preserve">▼</w:t>
+      </w:r>
+      <w:r>
+        <w:t xml:space="preserve"> less). The </w:t>
+      </w:r>
+      <w:r>
+        <w:rPr>
+          <w:b/>
+          <w:bCs/>
+        </w:rPr>
+        <w:t xml:space="preserve">Load</w:t>
+      </w:r>
+      <w:r>
+        <w:t xml:space="preserve"> badge at the top of the page summarises the five bars.</w:t>
+      </w:r>
+    </w:p>
+    <w:p>
+      <w:pPr>
+        <w:pStyle w:val="ListParagraph"/>
+        <w:numPr>
+          <w:ilvl w:val="0"/>
+          <w:numId w:val="3"/>
+        </w:numPr>
+        <w:spacing w:after="50"/>
+      </w:pPr>
+      <w:r>
+        <w:t xml:space="preserve">Tap </w:t>
+      </w:r>
+      <w:r>
+        <w:rPr>
+          <w:b/>
+          <w:bCs/>
+        </w:rPr>
+        <w:t xml:space="preserve">How is this calculated?</w:t>
+      </w:r>
+      <w:r>
+        <w:t xml:space="preserve"> for one line per bar explaining its score.</w:t>
+      </w:r>
+    </w:p>
+    <w:p>
+      <w:pPr>
+        <w:pStyle w:val="ListParagraph"/>
+        <w:numPr>
+          <w:ilvl w:val="0"/>
+          <w:numId w:val="3"/>
+        </w:numPr>
+        <w:spacing w:after="50"/>
+      </w:pPr>
+      <w:r>
+        <w:t xml:space="preserve">At the bottom, </w:t>
+      </w:r>
+      <w:r>
+        <w:rPr>
+          <w:b/>
+          <w:bCs/>
+        </w:rPr>
+        <w:t xml:space="preserve">Optional updates</w:t>
+      </w:r>
+      <w:r>
+        <w:t xml:space="preserve"> holds Daily Review, Movement and Social. They add detail to the workload bars; skipping them has no penalty.</w:t>
       </w:r>
     </w:p>
     <w:p>
@@ -1773,10 +2107,10 @@
         </w:tblBorders>
       </w:tblPr>
       <w:tblGrid>
-        <w:gridCol w:w="2729"/>
-        <w:gridCol w:w="909"/>
-        <w:gridCol w:w="4043"/>
-        <w:gridCol w:w="2225"/>
+        <w:gridCol w:w="2499"/>
+        <w:gridCol w:w="833"/>
+        <w:gridCol w:w="4351"/>
+        <w:gridCol w:w="2223"/>
       </w:tblGrid>
       <w:tr>
         <w:trPr>
@@ -1784,7 +2118,7 @@
         </w:trPr>
         <w:tc>
           <w:tcPr>
-            <w:tcW w:type="dxa" w:w="2729"/>
+            <w:tcW w:type="dxa" w:w="2499"/>
             <w:tcBorders>
               <w:top w:val="single" w:color="D9DBE6" w:sz="4"/>
               <w:left w:val="single" w:color="D9DBE6" w:sz="4"/>
@@ -1817,7 +2151,7 @@
         </w:tc>
         <w:tc>
           <w:tcPr>
-            <w:tcW w:type="dxa" w:w="909"/>
+            <w:tcW w:type="dxa" w:w="833"/>
             <w:tcBorders>
               <w:top w:val="single" w:color="D9DBE6" w:sz="4"/>
               <w:left w:val="single" w:color="D9DBE6" w:sz="4"/>
@@ -1850,7 +2184,7 @@
         </w:tc>
         <w:tc>
           <w:tcPr>
-            <w:tcW w:type="dxa" w:w="4043"/>
+            <w:tcW w:type="dxa" w:w="4351"/>
             <w:tcBorders>
               <w:top w:val="single" w:color="D9DBE6" w:sz="4"/>
               <w:left w:val="single" w:color="D9DBE6" w:sz="4"/>
@@ -1883,7 +2217,7 @@
         </w:tc>
         <w:tc>
           <w:tcPr>
-            <w:tcW w:type="dxa" w:w="2225"/>
+            <w:tcW w:type="dxa" w:w="2223"/>
             <w:tcBorders>
               <w:top w:val="single" w:color="D9DBE6" w:sz="4"/>
               <w:left w:val="single" w:color="D9DBE6" w:sz="4"/>
@@ -1921,7 +2255,7 @@
         </w:trPr>
         <w:tc>
           <w:tcPr>
-            <w:tcW w:type="dxa" w:w="2729"/>
+            <w:tcW w:type="dxa" w:w="2499"/>
             <w:tcBorders>
               <w:top w:val="single" w:color="D9DBE6" w:sz="4"/>
               <w:left w:val="single" w:color="D9DBE6" w:sz="4"/>
@@ -1950,7 +2284,7 @@
         </w:tc>
         <w:tc>
           <w:tcPr>
-            <w:tcW w:type="dxa" w:w="909"/>
+            <w:tcW w:type="dxa" w:w="833"/>
             <w:tcBorders>
               <w:top w:val="single" w:color="D9DBE6" w:sz="4"/>
               <w:left w:val="single" w:color="D9DBE6" w:sz="4"/>
@@ -1979,59 +2313,59 @@
         </w:tc>
         <w:tc>
           <w:tcPr>
-            <w:tcW w:type="dxa" w:w="4043"/>
-            <w:tcBorders>
-              <w:top w:val="single" w:color="D9DBE6" w:sz="4"/>
-              <w:left w:val="single" w:color="D9DBE6" w:sz="4"/>
-              <w:bottom w:val="single" w:color="D9DBE6" w:sz="4"/>
-              <w:right w:val="single" w:color="D9DBE6" w:sz="4"/>
-            </w:tcBorders>
-            <w:tcMar>
-              <w:top w:type="dxa" w:w="60"/>
-              <w:left w:type="dxa" w:w="100"/>
-              <w:bottom w:type="dxa" w:w="60"/>
-              <w:right w:type="dxa" w:w="100"/>
-            </w:tcMar>
-          </w:tcPr>
-          <w:p>
-            <w:pPr>
-              <w:spacing w:after="0"/>
-            </w:pPr>
-            <w:r>
-              <w:rPr>
-                <w:sz w:val="19"/>
-                <w:szCs w:val="19"/>
-              </w:rPr>
-              <w:t xml:space="preserve">Scheduled 09:00–12:00 on the sample date</w:t>
-            </w:r>
-          </w:p>
-        </w:tc>
-        <w:tc>
-          <w:tcPr>
-            <w:tcW w:type="dxa" w:w="2225"/>
-            <w:tcBorders>
-              <w:top w:val="single" w:color="D9DBE6" w:sz="4"/>
-              <w:left w:val="single" w:color="D9DBE6" w:sz="4"/>
-              <w:bottom w:val="single" w:color="D9DBE6" w:sz="4"/>
-              <w:right w:val="single" w:color="D9DBE6" w:sz="4"/>
-            </w:tcBorders>
-            <w:tcMar>
-              <w:top w:type="dxa" w:w="60"/>
-              <w:left w:type="dxa" w:w="100"/>
-              <w:bottom w:type="dxa" w:w="60"/>
-              <w:right w:type="dxa" w:w="100"/>
-            </w:tcMar>
-          </w:tcPr>
-          <w:p>
-            <w:pPr>
-              <w:spacing w:after="0"/>
-            </w:pPr>
-            <w:r>
-              <w:rPr>
-                <w:sz w:val="19"/>
-                <w:szCs w:val="19"/>
-              </w:rPr>
-              <w:t xml:space="preserve">The next day, 17:00</w:t>
+            <w:tcW w:type="dxa" w:w="4351"/>
+            <w:tcBorders>
+              <w:top w:val="single" w:color="D9DBE6" w:sz="4"/>
+              <w:left w:val="single" w:color="D9DBE6" w:sz="4"/>
+              <w:bottom w:val="single" w:color="D9DBE6" w:sz="4"/>
+              <w:right w:val="single" w:color="D9DBE6" w:sz="4"/>
+            </w:tcBorders>
+            <w:tcMar>
+              <w:top w:type="dxa" w:w="60"/>
+              <w:left w:type="dxa" w:w="100"/>
+              <w:bottom w:type="dxa" w:w="60"/>
+              <w:right w:type="dxa" w:w="100"/>
+            </w:tcMar>
+          </w:tcPr>
+          <w:p>
+            <w:pPr>
+              <w:spacing w:after="0"/>
+            </w:pPr>
+            <w:r>
+              <w:rPr>
+                <w:sz w:val="19"/>
+                <w:szCs w:val="19"/>
+              </w:rPr>
+              <w:t xml:space="preserve">Scheduled 9:00 AM – 12:00 PM on the sample date</w:t>
+            </w:r>
+          </w:p>
+        </w:tc>
+        <w:tc>
+          <w:tcPr>
+            <w:tcW w:type="dxa" w:w="2223"/>
+            <w:tcBorders>
+              <w:top w:val="single" w:color="D9DBE6" w:sz="4"/>
+              <w:left w:val="single" w:color="D9DBE6" w:sz="4"/>
+              <w:bottom w:val="single" w:color="D9DBE6" w:sz="4"/>
+              <w:right w:val="single" w:color="D9DBE6" w:sz="4"/>
+            </w:tcBorders>
+            <w:tcMar>
+              <w:top w:type="dxa" w:w="60"/>
+              <w:left w:type="dxa" w:w="100"/>
+              <w:bottom w:type="dxa" w:w="60"/>
+              <w:right w:type="dxa" w:w="100"/>
+            </w:tcMar>
+          </w:tcPr>
+          <w:p>
+            <w:pPr>
+              <w:spacing w:after="0"/>
+            </w:pPr>
+            <w:r>
+              <w:rPr>
+                <w:sz w:val="19"/>
+                <w:szCs w:val="19"/>
+              </w:rPr>
+              <w:t xml:space="preserve">The next day, 5:00 PM</w:t>
             </w:r>
           </w:p>
         </w:tc>
@@ -2042,7 +2376,7 @@
         </w:trPr>
         <w:tc>
           <w:tcPr>
-            <w:tcW w:type="dxa" w:w="2729"/>
+            <w:tcW w:type="dxa" w:w="2499"/>
             <w:tcBorders>
               <w:top w:val="single" w:color="D9DBE6" w:sz="4"/>
               <w:left w:val="single" w:color="D9DBE6" w:sz="4"/>
@@ -2072,7 +2406,7 @@
         </w:tc>
         <w:tc>
           <w:tcPr>
-            <w:tcW w:type="dxa" w:w="909"/>
+            <w:tcW w:type="dxa" w:w="833"/>
             <w:tcBorders>
               <w:top w:val="single" w:color="D9DBE6" w:sz="4"/>
               <w:left w:val="single" w:color="D9DBE6" w:sz="4"/>
@@ -2102,7 +2436,7 @@
         </w:tc>
         <w:tc>
           <w:tcPr>
-            <w:tcW w:type="dxa" w:w="4043"/>
+            <w:tcW w:type="dxa" w:w="4351"/>
             <w:tcBorders>
               <w:top w:val="single" w:color="D9DBE6" w:sz="4"/>
               <w:left w:val="single" w:color="D9DBE6" w:sz="4"/>
@@ -2132,7 +2466,7 @@
         </w:tc>
         <w:tc>
           <w:tcPr>
-            <w:tcW w:type="dxa" w:w="2225"/>
+            <w:tcW w:type="dxa" w:w="2223"/>
             <w:tcBorders>
               <w:top w:val="single" w:color="D9DBE6" w:sz="4"/>
               <w:left w:val="single" w:color="D9DBE6" w:sz="4"/>
@@ -2156,7 +2490,7 @@
                 <w:sz w:val="19"/>
                 <w:szCs w:val="19"/>
               </w:rPr>
-              <w:t xml:space="preserve">The sample date, 17:00</w:t>
+              <w:t xml:space="preserve">The sample date, 5:00 PM</w:t>
             </w:r>
           </w:p>
         </w:tc>
@@ -2182,17 +2516,24 @@
         <w:spacing w:after="50"/>
       </w:pPr>
       <w:r>
-        <w:t xml:space="preserve">Each task card shows its category (Study, Errand, Social, Exercise or Other), its flexibility, and whether it is </w:t>
-      </w:r>
-      <w:r>
-        <w:rPr>
-          <w:b/>
-          <w:bCs/>
-        </w:rPr>
-        <w:t xml:space="preserve">Protected</w:t>
-      </w:r>
-      <w:r>
-        <w:t xml:space="preserve">. Protected commitments such as a work shift, family duty or sleep minimum are never moved to make a plan fit.</w:t>
+        <w:rPr>
+          <w:b/>
+          <w:bCs/>
+        </w:rPr>
+        <w:t xml:space="preserve">Tap a task</w:t>
+      </w:r>
+      <w:r>
+        <w:t xml:space="preserve"> to open its details: remaining time, deadline, category, flexibility and status, with an </w:t>
+      </w:r>
+      <w:r>
+        <w:rPr>
+          <w:b/>
+          <w:bCs/>
+        </w:rPr>
+        <w:t xml:space="preserve">Edit task</w:t>
+      </w:r>
+      <w:r>
+        <w:t xml:space="preserve"> button.</w:t>
       </w:r>
     </w:p>
     <w:p>
@@ -2205,6 +2546,29 @@
         <w:spacing w:after="50"/>
       </w:pPr>
       <w:r>
+        <w:t xml:space="preserve">Each card shows its category (Study, Errand, Social, Exercise or Other), its flexibility and whether it is </w:t>
+      </w:r>
+      <w:r>
+        <w:rPr>
+          <w:b/>
+          <w:bCs/>
+        </w:rPr>
+        <w:t xml:space="preserve">Protected</w:t>
+      </w:r>
+      <w:r>
+        <w:t xml:space="preserve">. Protected commitments such as a work shift, family duty or sleep minimum are never moved to make a plan fit.</w:t>
+      </w:r>
+    </w:p>
+    <w:p>
+      <w:pPr>
+        <w:pStyle w:val="ListParagraph"/>
+        <w:numPr>
+          <w:ilvl w:val="0"/>
+          <w:numId w:val="4"/>
+        </w:numPr>
+        <w:spacing w:after="50"/>
+      </w:pPr>
+      <w:r>
         <w:t xml:space="preserve">Optional: tap </w:t>
       </w:r>
       <w:r>
@@ -2212,20 +2576,10 @@
           <w:b/>
           <w:bCs/>
         </w:rPr>
-        <w:t xml:space="preserve">Add task</w:t>
-      </w:r>
-      <w:r>
-        <w:t xml:space="preserve">, then </w:t>
-      </w:r>
-      <w:r>
-        <w:rPr>
-          <w:b/>
-          <w:bCs/>
-        </w:rPr>
-        <w:t xml:space="preserve">Cancel</w:t>
-      </w:r>
-      <w:r>
-        <w:t xml:space="preserve">. A new task cannot be saved without a category.</w:t>
+        <w:t xml:space="preserve">+</w:t>
+      </w:r>
+      <w:r>
+        <w:t xml:space="preserve">, then close the form. A new task cannot be saved without a category.</w:t>
       </w:r>
     </w:p>
     <w:p>
@@ -2286,7 +2640,7 @@
         <w:t xml:space="preserve">2 hours of the flexible report to the next day</w:t>
       </w:r>
       <w:r>
-        <w:t xml:space="preserve">, where 2 hours are free (09:00–11:00) and the report's deadline is still met. Each option lists the </w:t>
+        <w:t xml:space="preserve">, where 2 hours are free (9:00 – 11:00 AM) and the report's deadline is still met. Each option lists the </w:t>
       </w:r>
       <w:r>
         <w:rPr>
@@ -2372,7 +2726,7 @@
         <w:t xml:space="preserve">Confirm selected plan</w:t>
       </w:r>
       <w:r>
-        <w:t xml:space="preserve">, then confirm in the final preview.</w:t>
+        <w:t xml:space="preserve">, then confirm in the final preview. A soft chime plays if sound effects are on.</w:t>
       </w:r>
     </w:p>
     <w:p>
@@ -2542,7 +2896,7 @@
     </w:p>
     <w:p>
       <w:r>
-        <w:t xml:space="preserve">Recovery time is optional. Balance only lets you protect time that is genuinely free.</w:t>
+        <w:t xml:space="preserve">Recovery time is optional. Balance only lets you protect time that is genuinely free, and it suggests that time for you.</w:t>
       </w:r>
     </w:p>
     <w:p>
@@ -2588,17 +2942,27 @@
         <w:spacing w:after="50"/>
       </w:pPr>
       <w:r>
-        <w:t xml:space="preserve">Choose the </w:t>
-      </w:r>
-      <w:r>
-        <w:rPr>
-          <w:b/>
-          <w:bCs/>
-        </w:rPr>
-        <w:t xml:space="preserve">day after the sample date</w:t>
-      </w:r>
-      <w:r>
-        <w:t xml:space="preserve">, from 09:00 to 09:30, and tap </w:t>
+        <w:t xml:space="preserve">The form lists free time as one-tap suggestions. The sample date is fully booked, so it shows </w:t>
+      </w:r>
+      <w:r>
+        <w:rPr>
+          <w:b/>
+          <w:bCs/>
+        </w:rPr>
+        <w:t xml:space="preserve">Next free time · Mon 2 Nov</w:t>
+      </w:r>
+      <w:r>
+        <w:t xml:space="preserve"> with </w:t>
+      </w:r>
+      <w:r>
+        <w:rPr>
+          <w:b/>
+          <w:bCs/>
+        </w:rPr>
+        <w:t xml:space="preserve">9:00 AM – 11:00 AM · 2h free</w:t>
+      </w:r>
+      <w:r>
+        <w:t xml:space="preserve">, already selected as 9:00 – 9:30 AM. Choosing an activity is optional. Tap </w:t>
       </w:r>
       <w:r>
         <w:rPr>
@@ -2608,17 +2972,7 @@
         <w:t xml:space="preserve">Save</w:t>
       </w:r>
       <w:r>
-        <w:t xml:space="preserve">. The slot appears as </w:t>
-      </w:r>
-      <w:r>
-        <w:rPr>
-          <w:b/>
-          <w:bCs/>
-        </w:rPr>
-        <w:t xml:space="preserve">Protected time</w:t>
-      </w:r>
-      <w:r>
-        <w:t xml:space="preserve">. Choosing an activity is optional.</w:t>
+        <w:t xml:space="preserve">.</w:t>
       </w:r>
     </w:p>
     <w:p>
@@ -2631,17 +2985,17 @@
         <w:spacing w:after="50"/>
       </w:pPr>
       <w:r>
-        <w:t xml:space="preserve">Try the same on a day with no available time: the app explains that recovery time must fit inside available time and offers </w:t>
-      </w:r>
-      <w:r>
-        <w:rPr>
-          <w:b/>
-          <w:bCs/>
-        </w:rPr>
-        <w:t xml:space="preserve">Go to Today</w:t>
-      </w:r>
-      <w:r>
-        <w:t xml:space="preserve">.</w:t>
+        <w:t xml:space="preserve">The slot appears as </w:t>
+      </w:r>
+      <w:r>
+        <w:rPr>
+          <w:b/>
+          <w:bCs/>
+        </w:rPr>
+        <w:t xml:space="preserve">Protected time</w:t>
+      </w:r>
+      <w:r>
+        <w:t xml:space="preserve">. Marking an activity done does not change any workload score: rest is not graded.</w:t>
       </w:r>
     </w:p>
     <w:p>
@@ -2654,19 +3008,6 @@
         <w:spacing w:after="50"/>
       </w:pPr>
       <w:r>
-        <w:t xml:space="preserve">Marking an activity done does not change any workload score. Rest is not graded.</w:t>
-      </w:r>
-    </w:p>
-    <w:p>
-      <w:pPr>
-        <w:pStyle w:val="ListParagraph"/>
-        <w:numPr>
-          <w:ilvl w:val="0"/>
-          <w:numId w:val="7"/>
-        </w:numPr>
-        <w:spacing w:after="50"/>
-      </w:pPr>
-      <w:r>
         <w:rPr>
           <w:b/>
           <w:bCs/>
@@ -2692,7 +3033,7 @@
         <w:pStyle w:val="Heading1"/>
       </w:pPr>
       <w:r>
-        <w:t xml:space="preserve">7. Weekly summary and achievements (JOURNEY)</w:t>
+        <w:t xml:space="preserve">7. Weekly summary and achievement wall (JOURNEY)</w:t>
       </w:r>
     </w:p>
     <w:p>
@@ -2715,7 +3056,7 @@
         <w:t xml:space="preserve">JOURNEY</w:t>
       </w:r>
       <w:r>
-        <w:t xml:space="preserve">. It shows a private weekly summary for the selected week. Days without a record say </w:t>
+        <w:t xml:space="preserve"> and use the week arrows to reach the week of the sample date. Days without a record say </w:t>
       </w:r>
       <w:r>
         <w:rPr>
@@ -2791,47 +3132,17 @@
         <w:t xml:space="preserve">Achievements</w:t>
       </w:r>
       <w:r>
-        <w:t xml:space="preserve">: seven cards, each with its unlock condition. Your steps above can unlock </w:t>
-      </w:r>
-      <w:r>
-        <w:rPr>
-          <w:b/>
-          <w:bCs/>
-        </w:rPr>
-        <w:t xml:space="preserve">Safe Trade-off</w:t>
-      </w:r>
-      <w:r>
-        <w:t xml:space="preserve">, </w:t>
-      </w:r>
-      <w:r>
-        <w:rPr>
-          <w:b/>
-          <w:bCs/>
-        </w:rPr>
-        <w:t xml:space="preserve">Deadline Safety</w:t>
-      </w:r>
-      <w:r>
-        <w:t xml:space="preserve">, </w:t>
-      </w:r>
-      <w:r>
-        <w:rPr>
-          <w:b/>
-          <w:bCs/>
-        </w:rPr>
-        <w:t xml:space="preserve">Protected Rest</w:t>
-      </w:r>
-      <w:r>
-        <w:t xml:space="preserve"> and </w:t>
-      </w:r>
-      <w:r>
-        <w:rPr>
-          <w:b/>
-          <w:bCs/>
-        </w:rPr>
-        <w:t xml:space="preserve">Reflection</w:t>
-      </w:r>
-      <w:r>
-        <w:t xml:space="preserve">. Each badge is awarded once per account, so cards may already be unlocked if another judge used this account first.</w:t>
+        <w:t xml:space="preserve">: a wall of seven badges. Earned badges glow gold with their date; locked badges are dimmed with a lock. </w:t>
+      </w:r>
+      <w:r>
+        <w:rPr>
+          <w:b/>
+          <w:bCs/>
+        </w:rPr>
+        <w:t xml:space="preserve">Tap a badge</w:t>
+      </w:r>
+      <w:r>
+        <w:t xml:space="preserve"> to see how to unlock it.</w:t>
       </w:r>
     </w:p>
     <w:p>
@@ -2844,6 +3155,59 @@
         <w:spacing w:after="50"/>
       </w:pPr>
       <w:r>
+        <w:t xml:space="preserve">Your steps above can unlock </w:t>
+      </w:r>
+      <w:r>
+        <w:rPr>
+          <w:b/>
+          <w:bCs/>
+        </w:rPr>
+        <w:t xml:space="preserve">Safe Trade-off</w:t>
+      </w:r>
+      <w:r>
+        <w:t xml:space="preserve">, </w:t>
+      </w:r>
+      <w:r>
+        <w:rPr>
+          <w:b/>
+          <w:bCs/>
+        </w:rPr>
+        <w:t xml:space="preserve">Deadline Safety</w:t>
+      </w:r>
+      <w:r>
+        <w:t xml:space="preserve">, </w:t>
+      </w:r>
+      <w:r>
+        <w:rPr>
+          <w:b/>
+          <w:bCs/>
+        </w:rPr>
+        <w:t xml:space="preserve">Protected Rest</w:t>
+      </w:r>
+      <w:r>
+        <w:t xml:space="preserve"> and </w:t>
+      </w:r>
+      <w:r>
+        <w:rPr>
+          <w:b/>
+          <w:bCs/>
+        </w:rPr>
+        <w:t xml:space="preserve">Reflection</w:t>
+      </w:r>
+      <w:r>
+        <w:t xml:space="preserve">. A newly earned badge is celebrated once with an animation and a chime. Each badge is awarded once per account, so some may already be unlocked if another judge used this account first.</w:t>
+      </w:r>
+    </w:p>
+    <w:p>
+      <w:pPr>
+        <w:pStyle w:val="ListParagraph"/>
+        <w:numPr>
+          <w:ilvl w:val="0"/>
+          <w:numId w:val="8"/>
+        </w:numPr>
+        <w:spacing w:after="50"/>
+      </w:pPr>
+      <w:r>
         <w:rPr>
           <w:b/>
           <w:bCs/>
@@ -2867,6 +3231,107 @@
     <w:p>
       <w:r>
         <w:t xml:space="preserve">There are no streaks, rankings or penalties for skipping.</w:t>
+      </w:r>
+    </w:p>
+    <w:p>
+      <w:pPr>
+        <w:pStyle w:val="Heading1"/>
+      </w:pPr>
+      <w:r>
+        <w:t xml:space="preserve">8. Sound, reminders and alerts (PROFILE, optional)</w:t>
+      </w:r>
+    </w:p>
+    <w:p>
+      <w:pPr>
+        <w:pStyle w:val="ListParagraph"/>
+        <w:numPr>
+          <w:ilvl w:val="0"/>
+          <w:numId w:val="9"/>
+        </w:numPr>
+        <w:spacing w:after="50"/>
+      </w:pPr>
+      <w:r>
+        <w:t xml:space="preserve">Tap the round profile icon at the top right.</w:t>
+      </w:r>
+    </w:p>
+    <w:p>
+      <w:pPr>
+        <w:pStyle w:val="ListParagraph"/>
+        <w:numPr>
+          <w:ilvl w:val="0"/>
+          <w:numId w:val="9"/>
+        </w:numPr>
+        <w:spacing w:after="50"/>
+      </w:pPr>
+      <w:r>
+        <w:rPr>
+          <w:b/>
+          <w:bCs/>
+        </w:rPr>
+        <w:t xml:space="preserve">Sound effects</w:t>
+      </w:r>
+      <w:r>
+        <w:t xml:space="preserve"> (on by default) and </w:t>
+      </w:r>
+      <w:r>
+        <w:rPr>
+          <w:b/>
+          <w:bCs/>
+        </w:rPr>
+        <w:t xml:space="preserve">Relaxing background music</w:t>
+      </w:r>
+      <w:r>
+        <w:t xml:space="preserve"> (off by default) can be switched here. All audio is original to Balance.</w:t>
+      </w:r>
+    </w:p>
+    <w:p>
+      <w:pPr>
+        <w:pStyle w:val="ListParagraph"/>
+        <w:numPr>
+          <w:ilvl w:val="0"/>
+          <w:numId w:val="9"/>
+        </w:numPr>
+        <w:spacing w:after="50"/>
+      </w:pPr>
+      <w:r>
+        <w:rPr>
+          <w:b/>
+          <w:bCs/>
+        </w:rPr>
+        <w:t xml:space="preserve">Reminders and alerts</w:t>
+      </w:r>
+      <w:r>
+        <w:t xml:space="preserve"> holds deadline reminders and </w:t>
+      </w:r>
+      <w:r>
+        <w:rPr>
+          <w:b/>
+          <w:bCs/>
+        </w:rPr>
+        <w:t xml:space="preserve">Overload alerts</w:t>
+      </w:r>
+      <w:r>
+        <w:t xml:space="preserve">: a notification the evening before a day with more planned work than available time. Both are off by default and ask for notification permission when turned on.</w:t>
+      </w:r>
+    </w:p>
+    <w:p>
+      <w:pPr>
+        <w:pStyle w:val="ListParagraph"/>
+        <w:numPr>
+          <w:ilvl w:val="0"/>
+          <w:numId w:val="9"/>
+        </w:numPr>
+        <w:spacing w:after="50"/>
+      </w:pPr>
+      <w:r>
+        <w:rPr>
+          <w:b/>
+          <w:bCs/>
+        </w:rPr>
+        <w:t xml:space="preserve">How Balance works</w:t>
+      </w:r>
+      <w:r>
+        <w:t xml:space="preserve"> reopens the introduction.</w:t>
       </w:r>
     </w:p>
     <w:p>
@@ -2890,8 +3355,8 @@
         </w:tblBorders>
       </w:tblPr>
       <w:tblGrid>
-        <w:gridCol w:w="3583"/>
-        <w:gridCol w:w="6323"/>
+        <w:gridCol w:w="4953"/>
+        <w:gridCol w:w="4953"/>
       </w:tblGrid>
       <w:tr>
         <w:trPr>
@@ -2899,7 +3364,7 @@
         </w:trPr>
         <w:tc>
           <w:tcPr>
-            <w:tcW w:type="dxa" w:w="3583"/>
+            <w:tcW w:type="dxa" w:w="4953"/>
             <w:tcBorders>
               <w:top w:val="single" w:color="D9DBE6" w:sz="4"/>
               <w:left w:val="single" w:color="D9DBE6" w:sz="4"/>
@@ -2932,7 +3397,7 @@
         </w:tc>
         <w:tc>
           <w:tcPr>
-            <w:tcW w:type="dxa" w:w="6323"/>
+            <w:tcW w:type="dxa" w:w="4953"/>
             <w:tcBorders>
               <w:top w:val="single" w:color="D9DBE6" w:sz="4"/>
               <w:left w:val="single" w:color="D9DBE6" w:sz="4"/>
@@ -2970,7 +3435,7 @@
         </w:trPr>
         <w:tc>
           <w:tcPr>
-            <w:tcW w:type="dxa" w:w="3583"/>
+            <w:tcW w:type="dxa" w:w="4953"/>
             <w:tcBorders>
               <w:top w:val="single" w:color="D9DBE6" w:sz="4"/>
               <w:left w:val="single" w:color="D9DBE6" w:sz="4"/>
@@ -3008,7 +3473,7 @@
         </w:tc>
         <w:tc>
           <w:tcPr>
-            <w:tcW w:type="dxa" w:w="6323"/>
+            <w:tcW w:type="dxa" w:w="4953"/>
             <w:tcBorders>
               <w:top w:val="single" w:color="D9DBE6" w:sz="4"/>
               <w:left w:val="single" w:color="D9DBE6" w:sz="4"/>
@@ -3058,7 +3523,7 @@
         </w:trPr>
         <w:tc>
           <w:tcPr>
-            <w:tcW w:type="dxa" w:w="3583"/>
+            <w:tcW w:type="dxa" w:w="4953"/>
             <w:tcBorders>
               <w:top w:val="single" w:color="D9DBE6" w:sz="4"/>
               <w:left w:val="single" w:color="D9DBE6" w:sz="4"/>
@@ -3088,7 +3553,7 @@
         </w:tc>
         <w:tc>
           <w:tcPr>
-            <w:tcW w:type="dxa" w:w="6323"/>
+            <w:tcW w:type="dxa" w:w="4953"/>
             <w:tcBorders>
               <w:top w:val="single" w:color="D9DBE6" w:sz="4"/>
               <w:left w:val="single" w:color="D9DBE6" w:sz="4"/>
@@ -3139,84 +3604,59 @@
         </w:trPr>
         <w:tc>
           <w:tcPr>
-            <w:tcW w:type="dxa" w:w="3583"/>
-            <w:tcBorders>
-              <w:top w:val="single" w:color="D9DBE6" w:sz="4"/>
-              <w:left w:val="single" w:color="D9DBE6" w:sz="4"/>
-              <w:bottom w:val="single" w:color="D9DBE6" w:sz="4"/>
-              <w:right w:val="single" w:color="D9DBE6" w:sz="4"/>
-            </w:tcBorders>
-            <w:tcMar>
-              <w:top w:type="dxa" w:w="60"/>
-              <w:left w:type="dxa" w:w="100"/>
-              <w:bottom w:type="dxa" w:w="60"/>
-              <w:right w:type="dxa" w:w="100"/>
-            </w:tcMar>
-          </w:tcPr>
-          <w:p>
-            <w:pPr>
-              <w:spacing w:after="0"/>
-            </w:pPr>
-            <w:r>
-              <w:rPr>
-                <w:sz w:val="19"/>
-                <w:szCs w:val="19"/>
-              </w:rPr>
-              <w:t xml:space="preserve">Council shows </w:t>
-            </w:r>
-            <w:r>
-              <w:rPr>
-                <w:b/>
-                <w:bCs/>
-                <w:sz w:val="19"/>
-                <w:szCs w:val="19"/>
-              </w:rPr>
-              <w:t xml:space="preserve">No Feasible Plan</w:t>
-            </w:r>
-          </w:p>
-        </w:tc>
-        <w:tc>
-          <w:tcPr>
-            <w:tcW w:type="dxa" w:w="6323"/>
-            <w:tcBorders>
-              <w:top w:val="single" w:color="D9DBE6" w:sz="4"/>
-              <w:left w:val="single" w:color="D9DBE6" w:sz="4"/>
-              <w:bottom w:val="single" w:color="D9DBE6" w:sz="4"/>
-              <w:right w:val="single" w:color="D9DBE6" w:sz="4"/>
-            </w:tcBorders>
-            <w:tcMar>
-              <w:top w:type="dxa" w:w="60"/>
-              <w:left w:type="dxa" w:w="100"/>
-              <w:bottom w:type="dxa" w:w="60"/>
-              <w:right w:type="dxa" w:w="100"/>
-            </w:tcMar>
-          </w:tcPr>
-          <w:p>
-            <w:pPr>
-              <w:spacing w:after="0"/>
-            </w:pPr>
-            <w:r>
-              <w:rPr>
-                <w:sz w:val="19"/>
-                <w:szCs w:val="19"/>
-              </w:rPr>
-              <w:t xml:space="preserve">A recovery slot may be occupying the next day. Remove it in </w:t>
-            </w:r>
-            <w:r>
-              <w:rPr>
-                <w:b/>
-                <w:bCs/>
-                <w:sz w:val="19"/>
-                <w:szCs w:val="19"/>
-              </w:rPr>
-              <w:t xml:space="preserve">SANCTUARY</w:t>
-            </w:r>
-            <w:r>
-              <w:rPr>
-                <w:sz w:val="19"/>
-                <w:szCs w:val="19"/>
-              </w:rPr>
-              <w:t xml:space="preserve"> (step 6.5).</w:t>
+            <w:tcW w:type="dxa" w:w="4953"/>
+            <w:tcBorders>
+              <w:top w:val="single" w:color="D9DBE6" w:sz="4"/>
+              <w:left w:val="single" w:color="D9DBE6" w:sz="4"/>
+              <w:bottom w:val="single" w:color="D9DBE6" w:sz="4"/>
+              <w:right w:val="single" w:color="D9DBE6" w:sz="4"/>
+            </w:tcBorders>
+            <w:tcMar>
+              <w:top w:type="dxa" w:w="60"/>
+              <w:left w:type="dxa" w:w="100"/>
+              <w:bottom w:type="dxa" w:w="60"/>
+              <w:right w:type="dxa" w:w="100"/>
+            </w:tcMar>
+          </w:tcPr>
+          <w:p>
+            <w:pPr>
+              <w:spacing w:after="0"/>
+            </w:pPr>
+            <w:r>
+              <w:rPr>
+                <w:sz w:val="19"/>
+                <w:szCs w:val="19"/>
+              </w:rPr>
+              <w:t xml:space="preserve">Times look several hours off (for example availability at 1:00 AM)</w:t>
+            </w:r>
+          </w:p>
+        </w:tc>
+        <w:tc>
+          <w:tcPr>
+            <w:tcW w:type="dxa" w:w="4953"/>
+            <w:tcBorders>
+              <w:top w:val="single" w:color="D9DBE6" w:sz="4"/>
+              <w:left w:val="single" w:color="D9DBE6" w:sz="4"/>
+              <w:bottom w:val="single" w:color="D9DBE6" w:sz="4"/>
+              <w:right w:val="single" w:color="D9DBE6" w:sz="4"/>
+            </w:tcBorders>
+            <w:tcMar>
+              <w:top w:type="dxa" w:w="60"/>
+              <w:left w:type="dxa" w:w="100"/>
+              <w:bottom w:type="dxa" w:w="60"/>
+              <w:right w:type="dxa" w:w="100"/>
+            </w:tcMar>
+          </w:tcPr>
+          <w:p>
+            <w:pPr>
+              <w:spacing w:after="0"/>
+            </w:pPr>
+            <w:r>
+              <w:rPr>
+                <w:sz w:val="19"/>
+                <w:szCs w:val="19"/>
+              </w:rPr>
+              <w:t xml:space="preserve">Set the phone to Malaysia time (Settings → System → Date &amp; time → automatic time zone), then reopen Balance.</w:t>
             </w:r>
           </w:p>
         </w:tc>
@@ -3227,7 +3667,7 @@
         </w:trPr>
         <w:tc>
           <w:tcPr>
-            <w:tcW w:type="dxa" w:w="3583"/>
+            <w:tcW w:type="dxa" w:w="4953"/>
             <w:tcBorders>
               <w:top w:val="single" w:color="D9DBE6" w:sz="4"/>
               <w:left w:val="single" w:color="D9DBE6" w:sz="4"/>
@@ -3251,13 +3691,22 @@
                 <w:sz w:val="19"/>
                 <w:szCs w:val="19"/>
               </w:rPr>
-              <w:t xml:space="preserve">Sign-in fails</w:t>
-            </w:r>
-          </w:p>
-        </w:tc>
-        <w:tc>
-          <w:tcPr>
-            <w:tcW w:type="dxa" w:w="6323"/>
+              <w:t xml:space="preserve">Council shows </w:t>
+            </w:r>
+            <w:r>
+              <w:rPr>
+                <w:b/>
+                <w:bCs/>
+                <w:sz w:val="19"/>
+                <w:szCs w:val="19"/>
+              </w:rPr>
+              <w:t xml:space="preserve">No Feasible Plan</w:t>
+            </w:r>
+          </w:p>
+        </w:tc>
+        <w:tc>
+          <w:tcPr>
+            <w:tcW w:type="dxa" w:w="4953"/>
             <w:tcBorders>
               <w:top w:val="single" w:color="D9DBE6" w:sz="4"/>
               <w:left w:val="single" w:color="D9DBE6" w:sz="4"/>
@@ -3281,7 +3730,23 @@
                 <w:sz w:val="19"/>
                 <w:szCs w:val="19"/>
               </w:rPr>
-              <w:t xml:space="preserve">Check the email and password from the submission form for typing errors.</w:t>
+              <w:t xml:space="preserve">A recovery slot may be occupying the next day. Remove it in </w:t>
+            </w:r>
+            <w:r>
+              <w:rPr>
+                <w:b/>
+                <w:bCs/>
+                <w:sz w:val="19"/>
+                <w:szCs w:val="19"/>
+              </w:rPr>
+              <w:t xml:space="preserve">SANCTUARY</w:t>
+            </w:r>
+            <w:r>
+              <w:rPr>
+                <w:sz w:val="19"/>
+                <w:szCs w:val="19"/>
+              </w:rPr>
+              <w:t xml:space="preserve"> (step 6.4).</w:t>
             </w:r>
           </w:p>
         </w:tc>
@@ -3292,7 +3757,151 @@
         </w:trPr>
         <w:tc>
           <w:tcPr>
-            <w:tcW w:type="dxa" w:w="3583"/>
+            <w:tcW w:type="dxa" w:w="4953"/>
+            <w:tcBorders>
+              <w:top w:val="single" w:color="D9DBE6" w:sz="4"/>
+              <w:left w:val="single" w:color="D9DBE6" w:sz="4"/>
+              <w:bottom w:val="single" w:color="D9DBE6" w:sz="4"/>
+              <w:right w:val="single" w:color="D9DBE6" w:sz="4"/>
+            </w:tcBorders>
+            <w:tcMar>
+              <w:top w:type="dxa" w:w="60"/>
+              <w:left w:type="dxa" w:w="100"/>
+              <w:bottom w:type="dxa" w:w="60"/>
+              <w:right w:type="dxa" w:w="100"/>
+            </w:tcMar>
+          </w:tcPr>
+          <w:p>
+            <w:pPr>
+              <w:spacing w:after="0"/>
+            </w:pPr>
+            <w:r>
+              <w:rPr>
+                <w:sz w:val="19"/>
+                <w:szCs w:val="19"/>
+              </w:rPr>
+              <w:t xml:space="preserve">No sound</w:t>
+            </w:r>
+          </w:p>
+        </w:tc>
+        <w:tc>
+          <w:tcPr>
+            <w:tcW w:type="dxa" w:w="4953"/>
+            <w:tcBorders>
+              <w:top w:val="single" w:color="D9DBE6" w:sz="4"/>
+              <w:left w:val="single" w:color="D9DBE6" w:sz="4"/>
+              <w:bottom w:val="single" w:color="D9DBE6" w:sz="4"/>
+              <w:right w:val="single" w:color="D9DBE6" w:sz="4"/>
+            </w:tcBorders>
+            <w:tcMar>
+              <w:top w:type="dxa" w:w="60"/>
+              <w:left w:type="dxa" w:w="100"/>
+              <w:bottom w:type="dxa" w:w="60"/>
+              <w:right w:type="dxa" w:w="100"/>
+            </w:tcMar>
+          </w:tcPr>
+          <w:p>
+            <w:pPr>
+              <w:spacing w:after="0"/>
+            </w:pPr>
+            <w:r>
+              <w:rPr>
+                <w:sz w:val="19"/>
+                <w:szCs w:val="19"/>
+              </w:rPr>
+              <w:t xml:space="preserve">Check </w:t>
+            </w:r>
+            <w:r>
+              <w:rPr>
+                <w:b/>
+                <w:bCs/>
+                <w:sz w:val="19"/>
+                <w:szCs w:val="19"/>
+              </w:rPr>
+              <w:t xml:space="preserve">Profile → Sound effects</w:t>
+            </w:r>
+            <w:r>
+              <w:rPr>
+                <w:sz w:val="19"/>
+                <w:szCs w:val="19"/>
+              </w:rPr>
+              <w:t xml:space="preserve"> and the phone's media volume.</w:t>
+            </w:r>
+          </w:p>
+        </w:tc>
+      </w:tr>
+      <w:tr>
+        <w:trPr>
+          <w:cantSplit/>
+        </w:trPr>
+        <w:tc>
+          <w:tcPr>
+            <w:tcW w:type="dxa" w:w="4953"/>
+            <w:tcBorders>
+              <w:top w:val="single" w:color="D9DBE6" w:sz="4"/>
+              <w:left w:val="single" w:color="D9DBE6" w:sz="4"/>
+              <w:bottom w:val="single" w:color="D9DBE6" w:sz="4"/>
+              <w:right w:val="single" w:color="D9DBE6" w:sz="4"/>
+            </w:tcBorders>
+            <w:shd w:fill="F5F5FA" w:val="clear"/>
+            <w:tcMar>
+              <w:top w:type="dxa" w:w="60"/>
+              <w:left w:type="dxa" w:w="100"/>
+              <w:bottom w:type="dxa" w:w="60"/>
+              <w:right w:type="dxa" w:w="100"/>
+            </w:tcMar>
+          </w:tcPr>
+          <w:p>
+            <w:pPr>
+              <w:spacing w:after="0"/>
+            </w:pPr>
+            <w:r>
+              <w:rPr>
+                <w:sz w:val="19"/>
+                <w:szCs w:val="19"/>
+              </w:rPr>
+              <w:t xml:space="preserve">Sign-in fails</w:t>
+            </w:r>
+          </w:p>
+        </w:tc>
+        <w:tc>
+          <w:tcPr>
+            <w:tcW w:type="dxa" w:w="4953"/>
+            <w:tcBorders>
+              <w:top w:val="single" w:color="D9DBE6" w:sz="4"/>
+              <w:left w:val="single" w:color="D9DBE6" w:sz="4"/>
+              <w:bottom w:val="single" w:color="D9DBE6" w:sz="4"/>
+              <w:right w:val="single" w:color="D9DBE6" w:sz="4"/>
+            </w:tcBorders>
+            <w:shd w:fill="F5F5FA" w:val="clear"/>
+            <w:tcMar>
+              <w:top w:type="dxa" w:w="60"/>
+              <w:left w:type="dxa" w:w="100"/>
+              <w:bottom w:type="dxa" w:w="60"/>
+              <w:right w:type="dxa" w:w="100"/>
+            </w:tcMar>
+          </w:tcPr>
+          <w:p>
+            <w:pPr>
+              <w:spacing w:after="0"/>
+            </w:pPr>
+            <w:r>
+              <w:rPr>
+                <w:sz w:val="19"/>
+                <w:szCs w:val="19"/>
+              </w:rPr>
+              <w:t xml:space="preserve">Check the email and password from the submission form for typing errors.</w:t>
+            </w:r>
+          </w:p>
+        </w:tc>
+      </w:tr>
+      <w:tr>
+        <w:trPr>
+          <w:cantSplit/>
+        </w:trPr>
+        <w:tc>
+          <w:tcPr>
+            <w:tcW w:type="dxa" w:w="4953"/>
             <w:tcBorders>
               <w:top w:val="single" w:color="D9DBE6" w:sz="4"/>
               <w:left w:val="single" w:color="D9DBE6" w:sz="4"/>
@@ -3321,7 +3930,7 @@
         </w:tc>
         <w:tc>
           <w:tcPr>
-            <w:tcW w:type="dxa" w:w="6323"/>
+            <w:tcW w:type="dxa" w:w="4953"/>
             <w:tcBorders>
               <w:top w:val="single" w:color="D9DBE6" w:sz="4"/>
               <w:left w:val="single" w:color="D9DBE6" w:sz="4"/>
@@ -3662,6 +4271,18 @@
     </w:lvl>
   </w:abstractNum>
   <w:abstractNum w:abstractNumId="8" w15:restartNumberingAfterBreak="0">
+    <w:multiLevelType w:val="hybridMultilevel"/>
+    <w:lvl w:ilvl="0" w15:tentative="1">
+      <w:start w:val="1"/>
+      <w:numFmt w:val="decimal"/>
+      <w:lvlText w:val="%1."/>
+      <w:lvlJc w:val="left"/>
+      <w:pPr>
+        <w:ind w:left="540" w:hanging="300"/>
+      </w:pPr>
+    </w:lvl>
+  </w:abstractNum>
+  <w:abstractNum w:abstractNumId="9" w15:restartNumberingAfterBreak="0">
     <w:multiLevelType w:val="hybridMultilevel"/>
     <w:lvl w:ilvl="0" w15:tentative="1">
       <w:start w:val="1"/>
@@ -3717,6 +4338,12 @@
   </w:num>
   <w:num w:numId="8">
     <w:abstractNumId w:val="8"/>
+    <w:lvlOverride w:ilvl="0">
+      <w:startOverride w:val="1"/>
+    </w:lvlOverride>
+  </w:num>
+  <w:num w:numId="9">
+    <w:abstractNumId w:val="9"/>
     <w:lvlOverride w:ilvl="0">
       <w:startOverride w:val="1"/>
     </w:lvlOverride>

</xml_diff>

<commit_message>
Journey: celebrate new achievements on open; refresh guide screenshots for the RPG styling
The unlock watcher sat at the bottom of a lazy ListView, so the celebration only ran after scrolling down. Account email blurred in the profile screenshot.
</commit_message>
<xml_diff>
--- a/docs/Balance_User_Guide.docx
+++ b/docs/Balance_User_Guide.docx
@@ -1576,7 +1576,7 @@
             <w:pPr>
               <w:spacing w:after="0"/>
             </w:pPr>
-            <w:hyperlink w:history="1" r:id="rIdew4phtac1rdklssdzbvxr">
+            <w:hyperlink w:history="1" r:id="rIdo8quubb6ethnmhfpm5em1">
               <w:r>
                 <w:rPr>
                   <w:rStyle w:val="Hyperlink"/>
@@ -5461,7 +5461,7 @@
         <w:t xml:space="preserve">ACHIEVEMENT UNLOCKED</w:t>
       </w:r>
       <w:r>
-        <w:t xml:space="preserve"> animation and a chime. Badges are earned once per account, so some may already be unlocked if another judge used the account first.</w:t>
+        <w:t xml:space="preserve"> animation and a chime when you next open Journey. Badges are earned once per account, so some may already be unlocked if another judge used the account first.</w:t>
       </w:r>
     </w:p>
     <w:p>
@@ -6164,8 +6164,8 @@
         </w:tblBorders>
       </w:tblPr>
       <w:tblGrid>
-        <w:gridCol w:w="4782"/>
-        <w:gridCol w:w="5124"/>
+        <w:gridCol w:w="4953"/>
+        <w:gridCol w:w="4953"/>
       </w:tblGrid>
       <w:tr>
         <w:trPr>
@@ -6173,7 +6173,7 @@
         </w:trPr>
         <w:tc>
           <w:tcPr>
-            <w:tcW w:type="dxa" w:w="4782"/>
+            <w:tcW w:type="dxa" w:w="4953"/>
             <w:tcBorders>
               <w:top w:val="single" w:color="D9DBE6" w:sz="4"/>
               <w:left w:val="single" w:color="D9DBE6" w:sz="4"/>
@@ -6206,7 +6206,7 @@
         </w:tc>
         <w:tc>
           <w:tcPr>
-            <w:tcW w:type="dxa" w:w="5124"/>
+            <w:tcW w:type="dxa" w:w="4953"/>
             <w:tcBorders>
               <w:top w:val="single" w:color="D9DBE6" w:sz="4"/>
               <w:left w:val="single" w:color="D9DBE6" w:sz="4"/>
@@ -6244,7 +6244,7 @@
         </w:trPr>
         <w:tc>
           <w:tcPr>
-            <w:tcW w:type="dxa" w:w="4782"/>
+            <w:tcW w:type="dxa" w:w="4953"/>
             <w:tcBorders>
               <w:top w:val="single" w:color="D9DBE6" w:sz="4"/>
               <w:left w:val="single" w:color="D9DBE6" w:sz="4"/>
@@ -6269,13 +6269,84 @@
                 <w:sz w:val="19"/>
                 <w:szCs w:val="19"/>
               </w:rPr>
-              <w:t xml:space="preserve">TODAY, QUESTS, COUNCIL, SANCTUARY, JOURNEY</w:t>
-            </w:r>
-          </w:p>
-        </w:tc>
-        <w:tc>
-          <w:tcPr>
-            <w:tcW w:type="dxa" w:w="5124"/>
+              <w:t xml:space="preserve">TODAY</w:t>
+            </w:r>
+            <w:r>
+              <w:rPr>
+                <w:sz w:val="19"/>
+                <w:szCs w:val="19"/>
+              </w:rPr>
+              <w:t xml:space="preserve"> (globe), </w:t>
+            </w:r>
+            <w:r>
+              <w:rPr>
+                <w:b/>
+                <w:bCs/>
+                <w:sz w:val="19"/>
+                <w:szCs w:val="19"/>
+              </w:rPr>
+              <w:t xml:space="preserve">QUESTS</w:t>
+            </w:r>
+            <w:r>
+              <w:rPr>
+                <w:sz w:val="19"/>
+                <w:szCs w:val="19"/>
+              </w:rPr>
+              <w:t xml:space="preserve"> (quest book), </w:t>
+            </w:r>
+            <w:r>
+              <w:rPr>
+                <w:b/>
+                <w:bCs/>
+                <w:sz w:val="19"/>
+                <w:szCs w:val="19"/>
+              </w:rPr>
+              <w:t xml:space="preserve">COUNCIL</w:t>
+            </w:r>
+            <w:r>
+              <w:rPr>
+                <w:sz w:val="19"/>
+                <w:szCs w:val="19"/>
+              </w:rPr>
+              <w:t xml:space="preserve"> (castle), </w:t>
+            </w:r>
+            <w:r>
+              <w:rPr>
+                <w:b/>
+                <w:bCs/>
+                <w:sz w:val="19"/>
+                <w:szCs w:val="19"/>
+              </w:rPr>
+              <w:t xml:space="preserve">SANCTUARY</w:t>
+            </w:r>
+            <w:r>
+              <w:rPr>
+                <w:sz w:val="19"/>
+                <w:szCs w:val="19"/>
+              </w:rPr>
+              <w:t xml:space="preserve"> (campfire), </w:t>
+            </w:r>
+            <w:r>
+              <w:rPr>
+                <w:b/>
+                <w:bCs/>
+                <w:sz w:val="19"/>
+                <w:szCs w:val="19"/>
+              </w:rPr>
+              <w:t xml:space="preserve">JOURNEY</w:t>
+            </w:r>
+            <w:r>
+              <w:rPr>
+                <w:sz w:val="19"/>
+                <w:szCs w:val="19"/>
+              </w:rPr>
+              <w:t xml:space="preserve"> (compass)</w:t>
+            </w:r>
+          </w:p>
+        </w:tc>
+        <w:tc>
+          <w:tcPr>
+            <w:tcW w:type="dxa" w:w="4953"/>
             <w:tcBorders>
               <w:top w:val="single" w:color="D9DBE6" w:sz="4"/>
               <w:left w:val="single" w:color="D9DBE6" w:sz="4"/>
@@ -6309,7 +6380,7 @@
         </w:trPr>
         <w:tc>
           <w:tcPr>
-            <w:tcW w:type="dxa" w:w="4782"/>
+            <w:tcW w:type="dxa" w:w="4953"/>
             <w:tcBorders>
               <w:top w:val="single" w:color="D9DBE6" w:sz="4"/>
               <w:left w:val="single" w:color="D9DBE6" w:sz="4"/>
@@ -6371,7 +6442,7 @@
         </w:tc>
         <w:tc>
           <w:tcPr>
-            <w:tcW w:type="dxa" w:w="5124"/>
+            <w:tcW w:type="dxa" w:w="4953"/>
             <w:tcBorders>
               <w:top w:val="single" w:color="D9DBE6" w:sz="4"/>
               <w:left w:val="single" w:color="D9DBE6" w:sz="4"/>
@@ -6406,7 +6477,7 @@
         </w:trPr>
         <w:tc>
           <w:tcPr>
-            <w:tcW w:type="dxa" w:w="4782"/>
+            <w:tcW w:type="dxa" w:w="4953"/>
             <w:tcBorders>
               <w:top w:val="single" w:color="D9DBE6" w:sz="4"/>
               <w:left w:val="single" w:color="D9DBE6" w:sz="4"/>
@@ -6435,7 +6506,7 @@
         </w:tc>
         <w:tc>
           <w:tcPr>
-            <w:tcW w:type="dxa" w:w="5124"/>
+            <w:tcW w:type="dxa" w:w="4953"/>
             <w:tcBorders>
               <w:top w:val="single" w:color="D9DBE6" w:sz="4"/>
               <w:left w:val="single" w:color="D9DBE6" w:sz="4"/>
@@ -6469,7 +6540,7 @@
         </w:trPr>
         <w:tc>
           <w:tcPr>
-            <w:tcW w:type="dxa" w:w="4782"/>
+            <w:tcW w:type="dxa" w:w="4953"/>
             <w:tcBorders>
               <w:top w:val="single" w:color="D9DBE6" w:sz="4"/>
               <w:left w:val="single" w:color="D9DBE6" w:sz="4"/>
@@ -6499,7 +6570,7 @@
         </w:tc>
         <w:tc>
           <w:tcPr>
-            <w:tcW w:type="dxa" w:w="5124"/>
+            <w:tcW w:type="dxa" w:w="4953"/>
             <w:tcBorders>
               <w:top w:val="single" w:color="D9DBE6" w:sz="4"/>
               <w:left w:val="single" w:color="D9DBE6" w:sz="4"/>
@@ -6559,7 +6630,7 @@
         </w:trPr>
         <w:tc>
           <w:tcPr>
-            <w:tcW w:type="dxa" w:w="4782"/>
+            <w:tcW w:type="dxa" w:w="4953"/>
             <w:tcBorders>
               <w:top w:val="single" w:color="D9DBE6" w:sz="4"/>
               <w:left w:val="single" w:color="D9DBE6" w:sz="4"/>
@@ -6590,7 +6661,7 @@
         </w:tc>
         <w:tc>
           <w:tcPr>
-            <w:tcW w:type="dxa" w:w="5124"/>
+            <w:tcW w:type="dxa" w:w="4953"/>
             <w:tcBorders>
               <w:top w:val="single" w:color="D9DBE6" w:sz="4"/>
               <w:left w:val="single" w:color="D9DBE6" w:sz="4"/>

</xml_diff>

<commit_message>
Today: planned task cards show the minutes that count on the day, including plan-moved time
After a Council move the destination day listed the task with its remaining minutes on the original day (60 min) while capacity counted the moved 120 min.
</commit_message>
<xml_diff>
--- a/docs/Balance_User_Guide.docx
+++ b/docs/Balance_User_Guide.docx
@@ -1576,7 +1576,7 @@
             <w:pPr>
               <w:spacing w:after="0"/>
             </w:pPr>
-            <w:hyperlink w:history="1" r:id="rIdo8quubb6ethnmhfpm5em1">
+            <w:hyperlink w:history="1" r:id="rIdlrz--cush9yw29v7eoasl">
               <w:r>
                 <w:rPr>
                   <w:rStyle w:val="Hyperlink"/>
@@ -4438,7 +4438,27 @@
         <w:t xml:space="preserve">Return to Today</w:t>
       </w:r>
       <w:r>
-        <w:t xml:space="preserve"> and move to the next day: it now shows the 2 moved hours and still fits. The sample day is no longer over capacity.</w:t>
+        <w:t xml:space="preserve"> and move to the next day: the report now shows </w:t>
+      </w:r>
+      <w:r>
+        <w:rPr>
+          <w:b/>
+          <w:bCs/>
+        </w:rPr>
+        <w:t xml:space="preserve">120 min · Moved here by a plan</w:t>
+      </w:r>
+      <w:r>
+        <w:t xml:space="preserve">, and the day still fits. Back on the sample day, the report shows the </w:t>
+      </w:r>
+      <w:r>
+        <w:rPr>
+          <w:b/>
+          <w:bCs/>
+        </w:rPr>
+        <w:t xml:space="preserve">60 min</w:t>
+      </w:r>
+      <w:r>
+        <w:t xml:space="preserve"> that stayed there, and the day is no longer over capacity.</w:t>
       </w:r>
     </w:p>
     <w:p>
@@ -7411,7 +7431,55 @@
                 <w:sz w:val="19"/>
                 <w:szCs w:val="19"/>
               </w:rPr>
-              <w:t xml:space="preserve">Work that counts on this day; tap for details.</w:t>
+              <w:t xml:space="preserve">Work that counts on this day, with its minutes on this day and why: </w:t>
+            </w:r>
+            <w:r>
+              <w:rPr>
+                <w:i/>
+                <w:iCs/>
+                <w:sz w:val="19"/>
+                <w:szCs w:val="19"/>
+              </w:rPr>
+              <w:t xml:space="preserve">Scheduled this day</w:t>
+            </w:r>
+            <w:r>
+              <w:rPr>
+                <w:sz w:val="19"/>
+                <w:szCs w:val="19"/>
+              </w:rPr>
+              <w:t xml:space="preserve">, </w:t>
+            </w:r>
+            <w:r>
+              <w:rPr>
+                <w:i/>
+                <w:iCs/>
+                <w:sz w:val="19"/>
+                <w:szCs w:val="19"/>
+              </w:rPr>
+              <w:t xml:space="preserve">Due this day</w:t>
+            </w:r>
+            <w:r>
+              <w:rPr>
+                <w:sz w:val="19"/>
+                <w:szCs w:val="19"/>
+              </w:rPr>
+              <w:t xml:space="preserve"> or </w:t>
+            </w:r>
+            <w:r>
+              <w:rPr>
+                <w:i/>
+                <w:iCs/>
+                <w:sz w:val="19"/>
+                <w:szCs w:val="19"/>
+              </w:rPr>
+              <w:t xml:space="preserve">Moved here by a plan</w:t>
+            </w:r>
+            <w:r>
+              <w:rPr>
+                <w:sz w:val="19"/>
+                <w:szCs w:val="19"/>
+              </w:rPr>
+              <w:t xml:space="preserve">. Tap for details.</w:t>
             </w:r>
           </w:p>
         </w:tc>

</xml_diff>

<commit_message>
Music on by default with a gold header toggle; unlock sparks; parchment light look
- Background music starts on by default; a gold music-note button on every main page turns it off or on with a pop-and-ripple animation (static when animations are disabled).
- Chimes no longer take audio focus, so they no longer pause the background music.
- Achievement unlock adds a flash ring, gold sparks and a short vibration.
- Light look becomes warm parchment with ink-brown text; all text pairs at least 5:1.
</commit_message>
<xml_diff>
--- a/docs/Balance_User_Guide.docx
+++ b/docs/Balance_User_Guide.docx
@@ -1576,7 +1576,7 @@
             <w:pPr>
               <w:spacing w:after="0"/>
             </w:pPr>
-            <w:hyperlink w:history="1" r:id="rId7un2n_yhsztmbytpibbxh">
+            <w:hyperlink w:history="1" r:id="rIdybynkc07z0c_wmpafzmiq">
               <w:r>
                 <w:rPr>
                   <w:rStyle w:val="Hyperlink"/>
@@ -6068,7 +6068,17 @@
         <w:t xml:space="preserve">Relaxing background music</w:t>
       </w:r>
       <w:r>
-        <w:t xml:space="preserve"> (off by default) plays a calm ambient loop and pauses when the app is in the background. All audio is original to Balance.</w:t>
+        <w:t xml:space="preserve"> (on by default) plays a calm ambient loop and pauses when the app is in the background. To silence it at once, tap the gold </w:t>
+      </w:r>
+      <w:r>
+        <w:rPr>
+          <w:b/>
+          <w:bCs/>
+        </w:rPr>
+        <w:t xml:space="preserve">music note</w:t>
+      </w:r>
+      <w:r>
+        <w:t xml:space="preserve"> button at the top of any main page; it turns grey with a crossed-out note when the music is off. All audio is original to Balance.</w:t>
       </w:r>
     </w:p>
     <w:p>
@@ -6729,6 +6739,134 @@
                 <w:sz w:val="19"/>
                 <w:szCs w:val="19"/>
               </w:rPr>
+              <w:t xml:space="preserve">Gold music note</w:t>
+            </w:r>
+          </w:p>
+        </w:tc>
+        <w:tc>
+          <w:tcPr>
+            <w:tcW w:type="dxa" w:w="4953"/>
+            <w:tcBorders>
+              <w:top w:val="single" w:color="D9DBE6" w:sz="4"/>
+              <w:left w:val="single" w:color="D9DBE6" w:sz="4"/>
+              <w:bottom w:val="single" w:color="D9DBE6" w:sz="4"/>
+              <w:right w:val="single" w:color="D9DBE6" w:sz="4"/>
+            </w:tcBorders>
+            <w:tcMar>
+              <w:top w:type="dxa" w:w="60"/>
+              <w:left w:type="dxa" w:w="100"/>
+              <w:bottom w:type="dxa" w:w="60"/>
+              <w:right w:type="dxa" w:w="100"/>
+            </w:tcMar>
+          </w:tcPr>
+          <w:p>
+            <w:pPr>
+              <w:spacing w:after="0"/>
+            </w:pPr>
+            <w:r>
+              <w:rPr>
+                <w:sz w:val="19"/>
+                <w:szCs w:val="19"/>
+              </w:rPr>
+              <w:t xml:space="preserve">Turns the background music off or on (gold = playing, grey = off).</w:t>
+            </w:r>
+          </w:p>
+        </w:tc>
+      </w:tr>
+      <w:tr>
+        <w:trPr>
+          <w:cantSplit/>
+        </w:trPr>
+        <w:tc>
+          <w:tcPr>
+            <w:tcW w:type="dxa" w:w="4953"/>
+            <w:tcBorders>
+              <w:top w:val="single" w:color="D9DBE6" w:sz="4"/>
+              <w:left w:val="single" w:color="D9DBE6" w:sz="4"/>
+              <w:bottom w:val="single" w:color="D9DBE6" w:sz="4"/>
+              <w:right w:val="single" w:color="D9DBE6" w:sz="4"/>
+            </w:tcBorders>
+            <w:shd w:fill="F5F5FA" w:val="clear"/>
+            <w:tcMar>
+              <w:top w:type="dxa" w:w="60"/>
+              <w:left w:type="dxa" w:w="100"/>
+              <w:bottom w:type="dxa" w:w="60"/>
+              <w:right w:type="dxa" w:w="100"/>
+            </w:tcMar>
+          </w:tcPr>
+          <w:p>
+            <w:pPr>
+              <w:spacing w:after="0"/>
+            </w:pPr>
+            <w:r>
+              <w:rPr>
+                <w:sz w:val="19"/>
+                <w:szCs w:val="19"/>
+              </w:rPr>
+              <w:t xml:space="preserve">Sun / moon</w:t>
+            </w:r>
+          </w:p>
+        </w:tc>
+        <w:tc>
+          <w:tcPr>
+            <w:tcW w:type="dxa" w:w="4953"/>
+            <w:tcBorders>
+              <w:top w:val="single" w:color="D9DBE6" w:sz="4"/>
+              <w:left w:val="single" w:color="D9DBE6" w:sz="4"/>
+              <w:bottom w:val="single" w:color="D9DBE6" w:sz="4"/>
+              <w:right w:val="single" w:color="D9DBE6" w:sz="4"/>
+            </w:tcBorders>
+            <w:shd w:fill="F5F5FA" w:val="clear"/>
+            <w:tcMar>
+              <w:top w:type="dxa" w:w="60"/>
+              <w:left w:type="dxa" w:w="100"/>
+              <w:bottom w:type="dxa" w:w="60"/>
+              <w:right w:type="dxa" w:w="100"/>
+            </w:tcMar>
+          </w:tcPr>
+          <w:p>
+            <w:pPr>
+              <w:spacing w:after="0"/>
+            </w:pPr>
+            <w:r>
+              <w:rPr>
+                <w:sz w:val="19"/>
+                <w:szCs w:val="19"/>
+              </w:rPr>
+              <w:t xml:space="preserve">Switches between the dark look and the light parchment look; the choice is remembered.</w:t>
+            </w:r>
+          </w:p>
+        </w:tc>
+      </w:tr>
+      <w:tr>
+        <w:trPr>
+          <w:cantSplit/>
+        </w:trPr>
+        <w:tc>
+          <w:tcPr>
+            <w:tcW w:type="dxa" w:w="4953"/>
+            <w:tcBorders>
+              <w:top w:val="single" w:color="D9DBE6" w:sz="4"/>
+              <w:left w:val="single" w:color="D9DBE6" w:sz="4"/>
+              <w:bottom w:val="single" w:color="D9DBE6" w:sz="4"/>
+              <w:right w:val="single" w:color="D9DBE6" w:sz="4"/>
+            </w:tcBorders>
+            <w:tcMar>
+              <w:top w:type="dxa" w:w="60"/>
+              <w:left w:type="dxa" w:w="100"/>
+              <w:bottom w:type="dxa" w:w="60"/>
+              <w:right w:type="dxa" w:w="100"/>
+            </w:tcMar>
+          </w:tcPr>
+          <w:p>
+            <w:pPr>
+              <w:spacing w:after="0"/>
+            </w:pPr>
+            <w:r>
+              <w:rPr>
+                <w:sz w:val="19"/>
+                <w:szCs w:val="19"/>
+              </w:rPr>
               <w:t xml:space="preserve">Round profile icon</w:t>
             </w:r>
           </w:p>
@@ -12417,7 +12555,7 @@
                 <w:sz w:val="19"/>
                 <w:szCs w:val="19"/>
               </w:rPr>
-              <w:t xml:space="preserve">Check </w:t>
+              <w:t xml:space="preserve">Check that the music note at the top of the page is gold, </w:t>
             </w:r>
             <w:r>
               <w:rPr>
@@ -12433,7 +12571,7 @@
                 <w:sz w:val="19"/>
                 <w:szCs w:val="19"/>
               </w:rPr>
-              <w:t xml:space="preserve"> and the phone's media volume.</w:t>
+              <w:t xml:space="preserve">, and the phone's media volume.</w:t>
             </w:r>
           </w:p>
         </w:tc>
@@ -12467,7 +12605,7 @@
                 <w:sz w:val="19"/>
                 <w:szCs w:val="19"/>
               </w:rPr>
-              <w:t xml:space="preserve">Sign-in fails</w:t>
+              <w:t xml:space="preserve">Music is playing and you want quiet</w:t>
             </w:r>
           </w:p>
         </w:tc>
@@ -12496,7 +12634,7 @@
                 <w:sz w:val="19"/>
                 <w:szCs w:val="19"/>
               </w:rPr>
-              <w:t xml:space="preserve">Check the email and password from the submission form for typing errors.</w:t>
+              <w:t xml:space="preserve">Tap the gold music note at the top of any main page.</w:t>
             </w:r>
           </w:p>
         </w:tc>
@@ -12531,6 +12669,70 @@
                 <w:sz w:val="19"/>
                 <w:szCs w:val="19"/>
               </w:rPr>
+              <w:t xml:space="preserve">Sign-in fails</w:t>
+            </w:r>
+          </w:p>
+        </w:tc>
+        <w:tc>
+          <w:tcPr>
+            <w:tcW w:type="dxa" w:w="4953"/>
+            <w:tcBorders>
+              <w:top w:val="single" w:color="D9DBE6" w:sz="4"/>
+              <w:left w:val="single" w:color="D9DBE6" w:sz="4"/>
+              <w:bottom w:val="single" w:color="D9DBE6" w:sz="4"/>
+              <w:right w:val="single" w:color="D9DBE6" w:sz="4"/>
+            </w:tcBorders>
+            <w:shd w:fill="F5F5FA" w:val="clear"/>
+            <w:tcMar>
+              <w:top w:type="dxa" w:w="60"/>
+              <w:left w:type="dxa" w:w="100"/>
+              <w:bottom w:type="dxa" w:w="60"/>
+              <w:right w:type="dxa" w:w="100"/>
+            </w:tcMar>
+          </w:tcPr>
+          <w:p>
+            <w:pPr>
+              <w:spacing w:after="0"/>
+            </w:pPr>
+            <w:r>
+              <w:rPr>
+                <w:sz w:val="19"/>
+                <w:szCs w:val="19"/>
+              </w:rPr>
+              <w:t xml:space="preserve">Check the email and password from the submission form for typing errors.</w:t>
+            </w:r>
+          </w:p>
+        </w:tc>
+      </w:tr>
+      <w:tr>
+        <w:trPr>
+          <w:cantSplit/>
+        </w:trPr>
+        <w:tc>
+          <w:tcPr>
+            <w:tcW w:type="dxa" w:w="4953"/>
+            <w:tcBorders>
+              <w:top w:val="single" w:color="D9DBE6" w:sz="4"/>
+              <w:left w:val="single" w:color="D9DBE6" w:sz="4"/>
+              <w:bottom w:val="single" w:color="D9DBE6" w:sz="4"/>
+              <w:right w:val="single" w:color="D9DBE6" w:sz="4"/>
+            </w:tcBorders>
+            <w:tcMar>
+              <w:top w:type="dxa" w:w="60"/>
+              <w:left w:type="dxa" w:w="100"/>
+              <w:bottom w:type="dxa" w:w="60"/>
+              <w:right w:type="dxa" w:w="100"/>
+            </w:tcMar>
+          </w:tcPr>
+          <w:p>
+            <w:pPr>
+              <w:spacing w:after="0"/>
+            </w:pPr>
+            <w:r>
+              <w:rPr>
+                <w:sz w:val="19"/>
+                <w:szCs w:val="19"/>
+              </w:rPr>
               <w:t xml:space="preserve">"Can't install app"</w:t>
             </w:r>
           </w:p>
@@ -12544,7 +12746,6 @@
               <w:bottom w:val="single" w:color="D9DBE6" w:sz="4"/>
               <w:right w:val="single" w:color="D9DBE6" w:sz="4"/>
             </w:tcBorders>
-            <w:shd w:fill="F5F5FA" w:val="clear"/>
             <w:tcMar>
               <w:top w:type="dxa" w:w="60"/>
               <w:left w:type="dxa" w:w="100"/>

</xml_diff>

<commit_message>
Sections: core ones start open, chevron toggles, natural help labels; past-day Council note; 5-minute rounding
- Today (Availability, Planned tasks, Workload), Council (What stays protected), Sanctuary (All recovery slots) and Journey (Recovery kept, Achievements) start open; Optional updates and Finished stay folded.
- Fold/unfold uses a chevron instead of +/-, so it is not mistaken for Add.
- Help buttons read 'About <section>' instead of 'What is <section>?'.
- Council on a past day says the day has passed instead of listing free-time reasons.
- Free-time suggestions that start now begin at the next 5-minute mark.
</commit_message>
<xml_diff>
--- a/docs/Balance_User_Guide.docx
+++ b/docs/Balance_User_Guide.docx
@@ -1576,7 +1576,7 @@
             <w:pPr>
               <w:spacing w:after="0"/>
             </w:pPr>
-            <w:hyperlink w:history="1" r:id="rIdybynkc07z0c_wmpafzmiq">
+            <w:hyperlink w:history="1" r:id="rIdvbdee7rqykuv7q2gwtj0s">
               <w:r>
                 <w:rPr>
                   <w:rStyle w:val="Hyperlink"/>
@@ -3279,7 +3279,7 @@
         <w:t xml:space="preserve">Optional updates</w:t>
       </w:r>
       <w:r>
-        <w:t xml:space="preserve"> add detail to the workload bars. Skipping them has no penalty.</w:t>
+        <w:t xml:space="preserve"> add detail to the workload bars. Skipping them has no penalty. This section starts folded: tap its chevron (⌄) to open it.</w:t>
       </w:r>
     </w:p>
     <w:p>
@@ -6018,7 +6018,17 @@
         <w:t xml:space="preserve">World Status</w:t>
       </w:r>
       <w:r>
-        <w:t xml:space="preserve"> score as Today.</w:t>
+        <w:t xml:space="preserve"> score as Today. </w:t>
+      </w:r>
+      <w:r>
+        <w:rPr>
+          <w:b/>
+          <w:bCs/>
+        </w:rPr>
+        <w:t xml:space="preserve">Edit name</w:t>
+      </w:r>
+      <w:r>
+        <w:t xml:space="preserve"> changes the display name, and the camera badge on the round picture lets you choose a profile photo (kept on this phone only). On the shared judge account, please leave the name and photo as they are.</w:t>
       </w:r>
     </w:p>
     <w:p>
@@ -6987,6 +6997,175 @@
                 <w:szCs w:val="19"/>
               </w:rPr>
               <w:t xml:space="preserve"> on Journey.</w:t>
+            </w:r>
+          </w:p>
+        </w:tc>
+      </w:tr>
+      <w:tr>
+        <w:trPr>
+          <w:cantSplit/>
+        </w:trPr>
+        <w:tc>
+          <w:tcPr>
+            <w:tcW w:type="dxa" w:w="4953"/>
+            <w:tcBorders>
+              <w:top w:val="single" w:color="D9DBE6" w:sz="4"/>
+              <w:left w:val="single" w:color="D9DBE6" w:sz="4"/>
+              <w:bottom w:val="single" w:color="D9DBE6" w:sz="4"/>
+              <w:right w:val="single" w:color="D9DBE6" w:sz="4"/>
+            </w:tcBorders>
+            <w:tcMar>
+              <w:top w:type="dxa" w:w="60"/>
+              <w:left w:type="dxa" w:w="100"/>
+              <w:bottom w:type="dxa" w:w="60"/>
+              <w:right w:type="dxa" w:w="100"/>
+            </w:tcMar>
+          </w:tcPr>
+          <w:p>
+            <w:pPr>
+              <w:spacing w:after="0"/>
+            </w:pPr>
+            <w:r>
+              <w:rPr>
+                <w:b/>
+                <w:bCs/>
+                <w:sz w:val="19"/>
+                <w:szCs w:val="19"/>
+              </w:rPr>
+              <w:t xml:space="preserve">?</w:t>
+            </w:r>
+            <w:r>
+              <w:rPr>
+                <w:sz w:val="19"/>
+                <w:szCs w:val="19"/>
+              </w:rPr>
+              <w:t xml:space="preserve"> next to a title</w:t>
+            </w:r>
+          </w:p>
+        </w:tc>
+        <w:tc>
+          <w:tcPr>
+            <w:tcW w:type="dxa" w:w="4953"/>
+            <w:tcBorders>
+              <w:top w:val="single" w:color="D9DBE6" w:sz="4"/>
+              <w:left w:val="single" w:color="D9DBE6" w:sz="4"/>
+              <w:bottom w:val="single" w:color="D9DBE6" w:sz="4"/>
+              <w:right w:val="single" w:color="D9DBE6" w:sz="4"/>
+            </w:tcBorders>
+            <w:tcMar>
+              <w:top w:type="dxa" w:w="60"/>
+              <w:left w:type="dxa" w:w="100"/>
+              <w:bottom w:type="dxa" w:w="60"/>
+              <w:right w:type="dxa" w:w="100"/>
+            </w:tcMar>
+          </w:tcPr>
+          <w:p>
+            <w:pPr>
+              <w:spacing w:after="0"/>
+            </w:pPr>
+            <w:r>
+              <w:rPr>
+                <w:sz w:val="19"/>
+                <w:szCs w:val="19"/>
+              </w:rPr>
+              <w:t xml:space="preserve">Shows a one-line description of the page or section; tap again to hide it.</w:t>
+            </w:r>
+          </w:p>
+        </w:tc>
+      </w:tr>
+      <w:tr>
+        <w:trPr>
+          <w:cantSplit/>
+        </w:trPr>
+        <w:tc>
+          <w:tcPr>
+            <w:tcW w:type="dxa" w:w="4953"/>
+            <w:tcBorders>
+              <w:top w:val="single" w:color="D9DBE6" w:sz="4"/>
+              <w:left w:val="single" w:color="D9DBE6" w:sz="4"/>
+              <w:bottom w:val="single" w:color="D9DBE6" w:sz="4"/>
+              <w:right w:val="single" w:color="D9DBE6" w:sz="4"/>
+            </w:tcBorders>
+            <w:shd w:fill="F5F5FA" w:val="clear"/>
+            <w:tcMar>
+              <w:top w:type="dxa" w:w="60"/>
+              <w:left w:type="dxa" w:w="100"/>
+              <w:bottom w:type="dxa" w:w="60"/>
+              <w:right w:type="dxa" w:w="100"/>
+            </w:tcMar>
+          </w:tcPr>
+          <w:p>
+            <w:pPr>
+              <w:spacing w:after="0"/>
+            </w:pPr>
+            <w:r>
+              <w:rPr>
+                <w:sz w:val="19"/>
+                <w:szCs w:val="19"/>
+              </w:rPr>
+              <w:t xml:space="preserve">Chevron (⌄ / ⌃) on a section</w:t>
+            </w:r>
+          </w:p>
+        </w:tc>
+        <w:tc>
+          <w:tcPr>
+            <w:tcW w:type="dxa" w:w="4953"/>
+            <w:tcBorders>
+              <w:top w:val="single" w:color="D9DBE6" w:sz="4"/>
+              <w:left w:val="single" w:color="D9DBE6" w:sz="4"/>
+              <w:bottom w:val="single" w:color="D9DBE6" w:sz="4"/>
+              <w:right w:val="single" w:color="D9DBE6" w:sz="4"/>
+            </w:tcBorders>
+            <w:shd w:fill="F5F5FA" w:val="clear"/>
+            <w:tcMar>
+              <w:top w:type="dxa" w:w="60"/>
+              <w:left w:type="dxa" w:w="100"/>
+              <w:bottom w:type="dxa" w:w="60"/>
+              <w:right w:type="dxa" w:w="100"/>
+            </w:tcMar>
+          </w:tcPr>
+          <w:p>
+            <w:pPr>
+              <w:spacing w:after="0"/>
+            </w:pPr>
+            <w:r>
+              <w:rPr>
+                <w:sz w:val="19"/>
+                <w:szCs w:val="19"/>
+              </w:rPr>
+              <w:t xml:space="preserve">Folds or unfolds that section. The main sections start open; </w:t>
+            </w:r>
+            <w:r>
+              <w:rPr>
+                <w:i/>
+                <w:iCs/>
+                <w:sz w:val="19"/>
+                <w:szCs w:val="19"/>
+              </w:rPr>
+              <w:t xml:space="preserve">Optional updates</w:t>
+            </w:r>
+            <w:r>
+              <w:rPr>
+                <w:sz w:val="19"/>
+                <w:szCs w:val="19"/>
+              </w:rPr>
+              <w:t xml:space="preserve"> and </w:t>
+            </w:r>
+            <w:r>
+              <w:rPr>
+                <w:i/>
+                <w:iCs/>
+                <w:sz w:val="19"/>
+                <w:szCs w:val="19"/>
+              </w:rPr>
+              <w:t xml:space="preserve">Finished</w:t>
+            </w:r>
+            <w:r>
+              <w:rPr>
+                <w:sz w:val="19"/>
+                <w:szCs w:val="19"/>
+              </w:rPr>
+              <w:t xml:space="preserve"> start folded. Your choice is remembered on this phone.</w:t>
             </w:r>
           </w:p>
         </w:tc>

</xml_diff>

<commit_message>
Guide and beginner guide: Quests uses the Add task button
</commit_message>
<xml_diff>
--- a/docs/Balance_User_Guide.docx
+++ b/docs/Balance_User_Guide.docx
@@ -1576,7 +1576,7 @@
             <w:pPr>
               <w:spacing w:after="0"/>
             </w:pPr>
-            <w:hyperlink w:history="1" r:id="rIdvbdee7rqykuv7q2gwtj0s">
+            <w:hyperlink w:history="1" r:id="rId5xcar7afbggjdftaoiotf">
               <w:r>
                 <w:rPr>
                   <w:rStyle w:val="Hyperlink"/>
@@ -3976,17 +3976,17 @@
         <w:spacing w:after="50"/>
       </w:pPr>
       <w:r>
-        <w:t xml:space="preserve">Optional: tap </w:t>
-      </w:r>
-      <w:r>
-        <w:rPr>
-          <w:b/>
-          <w:bCs/>
-        </w:rPr>
-        <w:t xml:space="preserve">+</w:t>
-      </w:r>
-      <w:r>
-        <w:t xml:space="preserve"> to see the new task form, then close it without saving. A task needs a </w:t>
+        <w:t xml:space="preserve">Optional: tap the full-width </w:t>
+      </w:r>
+      <w:r>
+        <w:rPr>
+          <w:b/>
+          <w:bCs/>
+        </w:rPr>
+        <w:t xml:space="preserve">Add task</w:t>
+      </w:r>
+      <w:r>
+        <w:t xml:space="preserve"> button above the search box to see the new task form, then close it without saving. A task needs a </w:t>
       </w:r>
       <w:r>
         <w:rPr>
@@ -7230,7 +7230,23 @@
                 <w:sz w:val="19"/>
                 <w:szCs w:val="19"/>
               </w:rPr>
-              <w:t xml:space="preserve">Today: add a time block. Quests: add a task. Sanctuary: add recovery time.</w:t>
+              <w:t xml:space="preserve">Today: add a time block. Sanctuary: add recovery time. (Quests uses the full-width </w:t>
+            </w:r>
+            <w:r>
+              <w:rPr>
+                <w:b/>
+                <w:bCs/>
+                <w:sz w:val="19"/>
+                <w:szCs w:val="19"/>
+              </w:rPr>
+              <w:t xml:space="preserve">Add task</w:t>
+            </w:r>
+            <w:r>
+              <w:rPr>
+                <w:sz w:val="19"/>
+                <w:szCs w:val="19"/>
+              </w:rPr>
+              <w:t xml:space="preserve"> button.)</w:t>
             </w:r>
           </w:p>
         </w:tc>

</xml_diff>

<commit_message>
Guide: Sanctuary uses the full-width Add recovery time button
</commit_message>
<xml_diff>
--- a/docs/Balance_User_Guide.docx
+++ b/docs/Balance_User_Guide.docx
@@ -1576,7 +1576,7 @@
             <w:pPr>
               <w:spacing w:after="0"/>
             </w:pPr>
-            <w:hyperlink w:history="1" r:id="rId5xcar7afbggjdftaoiotf">
+            <w:hyperlink w:history="1" r:id="rIdhjvgo_fh27geic5mcstdb">
               <w:r>
                 <w:rPr>
                   <w:rStyle w:val="Hyperlink"/>
@@ -5156,17 +5156,7 @@
         <w:t xml:space="preserve">Add recovery time</w:t>
       </w:r>
       <w:r>
-        <w:t xml:space="preserve"> (also the </w:t>
-      </w:r>
-      <w:r>
-        <w:rPr>
-          <w:b/>
-          <w:bCs/>
-        </w:rPr>
-        <w:t xml:space="preserve">+</w:t>
-      </w:r>
-      <w:r>
-        <w:t xml:space="preserve"> at the top).</w:t>
+        <w:t xml:space="preserve">. Once you have slots, the same full-width button sits above the list.</w:t>
       </w:r>
     </w:p>
     <w:p>
@@ -7230,7 +7220,7 @@
                 <w:sz w:val="19"/>
                 <w:szCs w:val="19"/>
               </w:rPr>
-              <w:t xml:space="preserve">Today: add a time block. Sanctuary: add recovery time. (Quests uses the full-width </w:t>
+              <w:t xml:space="preserve">Today: add a time block. (Quests and Sanctuary use the full-width </w:t>
             </w:r>
             <w:r>
               <w:rPr>
@@ -7246,7 +7236,23 @@
                 <w:sz w:val="19"/>
                 <w:szCs w:val="19"/>
               </w:rPr>
-              <w:t xml:space="preserve"> button.)</w:t>
+              <w:t xml:space="preserve"> and </w:t>
+            </w:r>
+            <w:r>
+              <w:rPr>
+                <w:b/>
+                <w:bCs/>
+                <w:sz w:val="19"/>
+                <w:szCs w:val="19"/>
+              </w:rPr>
+              <w:t xml:space="preserve">Add recovery time</w:t>
+            </w:r>
+            <w:r>
+              <w:rPr>
+                <w:sz w:val="19"/>
+                <w:szCs w:val="19"/>
+              </w:rPr>
+              <w:t xml:space="preserve"> buttons.)</w:t>
             </w:r>
           </w:p>
         </w:tc>

</xml_diff>

<commit_message>
Sanctuary rest camp: campfire scene, crackle ambience and Breathe with the fire
- A small scene at the top of Sanctuary: tent, flickering campfire and drifting embers; the sky follows the clock (dawn, day, dusk, night). Still when animations are off; drawn still in widget tests.
- A soft original campfire crackle plays over the music only while Sanctuary is on screen and music is on; it mixes with the music and pauses in the background.
- Breathe with the fire: one optional minute of 4-4-4 breathing with the fire growing and settling; Stop any time; never recorded or scored.
</commit_message>
<xml_diff>
--- a/docs/Balance_User_Guide.docx
+++ b/docs/Balance_User_Guide.docx
@@ -1576,7 +1576,7 @@
             <w:pPr>
               <w:spacing w:after="0"/>
             </w:pPr>
-            <w:hyperlink w:history="1" r:id="rIdhjvgo_fh27geic5mcstdb">
+            <w:hyperlink w:history="1" r:id="rIdkdsosv2jbputm5u8qwzqz">
               <w:r>
                 <w:rPr>
                   <w:rStyle w:val="Hyperlink"/>
@@ -5107,6 +5107,54 @@
       </w:r>
     </w:p>
     <w:p>
+      <w:r>
+        <w:t xml:space="preserve">At the top is the </w:t>
+      </w:r>
+      <w:r>
+        <w:rPr>
+          <w:b/>
+          <w:bCs/>
+        </w:rPr>
+        <w:t xml:space="preserve">rest camp</w:t>
+      </w:r>
+      <w:r>
+        <w:t xml:space="preserve">: a tent beside a small campfire. The sky follows your phone's clock (dawn, day, dusk or night), the fire flickers gently, and while background music is on you hear a soft crackle that stops when you leave the page.</w:t>
+      </w:r>
+    </w:p>
+    <w:p>
+      <w:pPr>
+        <w:pStyle w:val="ListParagraph"/>
+        <w:numPr>
+          <w:ilvl w:val="0"/>
+          <w:numId w:val="2"/>
+        </w:numPr>
+        <w:spacing w:after="50"/>
+      </w:pPr>
+      <w:r>
+        <w:t xml:space="preserve">Optional: tap </w:t>
+      </w:r>
+      <w:r>
+        <w:rPr>
+          <w:b/>
+          <w:bCs/>
+        </w:rPr>
+        <w:t xml:space="preserve">Breathe with the fire</w:t>
+      </w:r>
+      <w:r>
+        <w:t xml:space="preserve"> for one minute of slow breathing. Breathe in for 4 seconds, hold for 4 and breathe out for 4 while the fire grows and settles with you. </w:t>
+      </w:r>
+      <w:r>
+        <w:rPr>
+          <w:b/>
+          <w:bCs/>
+        </w:rPr>
+        <w:t xml:space="preserve">Stop</w:t>
+      </w:r>
+      <w:r>
+        <w:t xml:space="preserve"> works at any time, and nothing is recorded or scored.</w:t>
+      </w:r>
+    </w:p>
+    <w:p>
       <w:pPr>
         <w:pStyle w:val="ListParagraph"/>
         <w:numPr>
@@ -9650,8 +9698,8 @@
         </w:tblBorders>
       </w:tblPr>
       <w:tblGrid>
-        <w:gridCol w:w="2187"/>
-        <w:gridCol w:w="7719"/>
+        <w:gridCol w:w="2568"/>
+        <w:gridCol w:w="7338"/>
       </w:tblGrid>
       <w:tr>
         <w:trPr>
@@ -9659,7 +9707,7 @@
         </w:trPr>
         <w:tc>
           <w:tcPr>
-            <w:tcW w:type="dxa" w:w="2187"/>
+            <w:tcW w:type="dxa" w:w="2568"/>
             <w:tcBorders>
               <w:top w:val="single" w:color="D9DBE6" w:sz="4"/>
               <w:left w:val="single" w:color="D9DBE6" w:sz="4"/>
@@ -9692,7 +9740,7 @@
         </w:tc>
         <w:tc>
           <w:tcPr>
-            <w:tcW w:type="dxa" w:w="7719"/>
+            <w:tcW w:type="dxa" w:w="7338"/>
             <w:tcBorders>
               <w:top w:val="single" w:color="D9DBE6" w:sz="4"/>
               <w:left w:val="single" w:color="D9DBE6" w:sz="4"/>
@@ -9730,77 +9778,59 @@
         </w:trPr>
         <w:tc>
           <w:tcPr>
-            <w:tcW w:type="dxa" w:w="2187"/>
-            <w:tcBorders>
-              <w:top w:val="single" w:color="D9DBE6" w:sz="4"/>
-              <w:left w:val="single" w:color="D9DBE6" w:sz="4"/>
-              <w:bottom w:val="single" w:color="D9DBE6" w:sz="4"/>
-              <w:right w:val="single" w:color="D9DBE6" w:sz="4"/>
-            </w:tcBorders>
-            <w:tcMar>
-              <w:top w:type="dxa" w:w="60"/>
-              <w:left w:type="dxa" w:w="100"/>
-              <w:bottom w:type="dxa" w:w="60"/>
-              <w:right w:type="dxa" w:w="100"/>
-            </w:tcMar>
-          </w:tcPr>
-          <w:p>
-            <w:pPr>
-              <w:spacing w:after="0"/>
-            </w:pPr>
-            <w:r>
-              <w:rPr>
-                <w:b/>
-                <w:bCs/>
-                <w:sz w:val="19"/>
-                <w:szCs w:val="19"/>
-              </w:rPr>
-              <w:t xml:space="preserve">Add recovery time</w:t>
-            </w:r>
-          </w:p>
-        </w:tc>
-        <w:tc>
-          <w:tcPr>
-            <w:tcW w:type="dxa" w:w="7719"/>
-            <w:tcBorders>
-              <w:top w:val="single" w:color="D9DBE6" w:sz="4"/>
-              <w:left w:val="single" w:color="D9DBE6" w:sz="4"/>
-              <w:bottom w:val="single" w:color="D9DBE6" w:sz="4"/>
-              <w:right w:val="single" w:color="D9DBE6" w:sz="4"/>
-            </w:tcBorders>
-            <w:tcMar>
-              <w:top w:type="dxa" w:w="60"/>
-              <w:left w:type="dxa" w:w="100"/>
-              <w:bottom w:type="dxa" w:w="60"/>
-              <w:right w:type="dxa" w:w="100"/>
-            </w:tcMar>
-          </w:tcPr>
-          <w:p>
-            <w:pPr>
-              <w:spacing w:after="0"/>
-            </w:pPr>
-            <w:r>
-              <w:rPr>
-                <w:sz w:val="19"/>
-                <w:szCs w:val="19"/>
-              </w:rPr>
-              <w:t xml:space="preserve">Opens </w:t>
-            </w:r>
-            <w:r>
-              <w:rPr>
-                <w:i/>
-                <w:iCs/>
-                <w:sz w:val="19"/>
-                <w:szCs w:val="19"/>
-              </w:rPr>
-              <w:t xml:space="preserve">Protect recovery time</w:t>
-            </w:r>
-            <w:r>
-              <w:rPr>
-                <w:sz w:val="19"/>
-                <w:szCs w:val="19"/>
-              </w:rPr>
-              <w:t xml:space="preserve"> with free-time suggestions.</w:t>
+            <w:tcW w:type="dxa" w:w="2568"/>
+            <w:tcBorders>
+              <w:top w:val="single" w:color="D9DBE6" w:sz="4"/>
+              <w:left w:val="single" w:color="D9DBE6" w:sz="4"/>
+              <w:bottom w:val="single" w:color="D9DBE6" w:sz="4"/>
+              <w:right w:val="single" w:color="D9DBE6" w:sz="4"/>
+            </w:tcBorders>
+            <w:tcMar>
+              <w:top w:type="dxa" w:w="60"/>
+              <w:left w:type="dxa" w:w="100"/>
+              <w:bottom w:type="dxa" w:w="60"/>
+              <w:right w:type="dxa" w:w="100"/>
+            </w:tcMar>
+          </w:tcPr>
+          <w:p>
+            <w:pPr>
+              <w:spacing w:after="0"/>
+            </w:pPr>
+            <w:r>
+              <w:rPr>
+                <w:sz w:val="19"/>
+                <w:szCs w:val="19"/>
+              </w:rPr>
+              <w:t xml:space="preserve">Rest camp</w:t>
+            </w:r>
+          </w:p>
+        </w:tc>
+        <w:tc>
+          <w:tcPr>
+            <w:tcW w:type="dxa" w:w="7338"/>
+            <w:tcBorders>
+              <w:top w:val="single" w:color="D9DBE6" w:sz="4"/>
+              <w:left w:val="single" w:color="D9DBE6" w:sz="4"/>
+              <w:bottom w:val="single" w:color="D9DBE6" w:sz="4"/>
+              <w:right w:val="single" w:color="D9DBE6" w:sz="4"/>
+            </w:tcBorders>
+            <w:tcMar>
+              <w:top w:type="dxa" w:w="60"/>
+              <w:left w:type="dxa" w:w="100"/>
+              <w:bottom w:type="dxa" w:w="60"/>
+              <w:right w:type="dxa" w:w="100"/>
+            </w:tcMar>
+          </w:tcPr>
+          <w:p>
+            <w:pPr>
+              <w:spacing w:after="0"/>
+            </w:pPr>
+            <w:r>
+              <w:rPr>
+                <w:sz w:val="19"/>
+                <w:szCs w:val="19"/>
+              </w:rPr>
+              <w:t xml:space="preserve">Tent and campfire; the sky follows the clock. Still picture when animations are turned off.</w:t>
             </w:r>
           </w:p>
         </w:tc>
@@ -9811,7 +9841,7 @@
         </w:trPr>
         <w:tc>
           <w:tcPr>
-            <w:tcW w:type="dxa" w:w="2187"/>
+            <w:tcW w:type="dxa" w:w="2568"/>
             <w:tcBorders>
               <w:top w:val="single" w:color="D9DBE6" w:sz="4"/>
               <w:left w:val="single" w:color="D9DBE6" w:sz="4"/>
@@ -9830,52 +9860,6 @@
             <w:pPr>
               <w:spacing w:after="0"/>
             </w:pPr>
-            <w:r>
-              <w:rPr>
-                <w:sz w:val="19"/>
-                <w:szCs w:val="19"/>
-              </w:rPr>
-              <w:t xml:space="preserve">Slot card</w:t>
-            </w:r>
-          </w:p>
-        </w:tc>
-        <w:tc>
-          <w:tcPr>
-            <w:tcW w:type="dxa" w:w="7719"/>
-            <w:tcBorders>
-              <w:top w:val="single" w:color="D9DBE6" w:sz="4"/>
-              <w:left w:val="single" w:color="D9DBE6" w:sz="4"/>
-              <w:bottom w:val="single" w:color="D9DBE6" w:sz="4"/>
-              <w:right w:val="single" w:color="D9DBE6" w:sz="4"/>
-            </w:tcBorders>
-            <w:shd w:fill="F5F5FA" w:val="clear"/>
-            <w:tcMar>
-              <w:top w:type="dxa" w:w="60"/>
-              <w:left w:type="dxa" w:w="100"/>
-              <w:bottom w:type="dxa" w:w="60"/>
-              <w:right w:type="dxa" w:w="100"/>
-            </w:tcMar>
-          </w:tcPr>
-          <w:p>
-            <w:pPr>
-              <w:spacing w:after="0"/>
-            </w:pPr>
-            <w:r>
-              <w:rPr>
-                <w:i/>
-                <w:iCs/>
-                <w:sz w:val="19"/>
-                <w:szCs w:val="19"/>
-              </w:rPr>
-              <w:t xml:space="preserve">Protected time</w:t>
-            </w:r>
-            <w:r>
-              <w:rPr>
-                <w:sz w:val="19"/>
-                <w:szCs w:val="19"/>
-              </w:rPr>
-              <w:t xml:space="preserve">, the time, </w:t>
-            </w:r>
             <w:r>
               <w:rPr>
                 <w:b/>
@@ -9883,46 +9867,37 @@
                 <w:sz w:val="19"/>
                 <w:szCs w:val="19"/>
               </w:rPr>
-              <w:t xml:space="preserve">TIME RESERVED</w:t>
-            </w:r>
-            <w:r>
-              <w:rPr>
-                <w:sz w:val="19"/>
-                <w:szCs w:val="19"/>
-              </w:rPr>
-              <w:t xml:space="preserve">; </w:t>
-            </w:r>
-            <w:r>
-              <w:rPr>
-                <w:b/>
-                <w:bCs/>
-                <w:sz w:val="19"/>
-                <w:szCs w:val="19"/>
-              </w:rPr>
-              <w:t xml:space="preserve">⋮ Edit/Remove</w:t>
-            </w:r>
-            <w:r>
-              <w:rPr>
-                <w:sz w:val="19"/>
-                <w:szCs w:val="19"/>
-              </w:rPr>
-              <w:t xml:space="preserve">; </w:t>
-            </w:r>
-            <w:r>
-              <w:rPr>
-                <w:i/>
-                <w:iCs/>
-                <w:sz w:val="19"/>
-                <w:szCs w:val="19"/>
-              </w:rPr>
-              <w:t xml:space="preserve">Activity done</w:t>
-            </w:r>
-            <w:r>
-              <w:rPr>
-                <w:sz w:val="19"/>
-                <w:szCs w:val="19"/>
-              </w:rPr>
-              <w:t xml:space="preserve"> once it has started.</w:t>
+              <w:t xml:space="preserve">Breathe with the fire</w:t>
+            </w:r>
+          </w:p>
+        </w:tc>
+        <w:tc>
+          <w:tcPr>
+            <w:tcW w:type="dxa" w:w="7338"/>
+            <w:tcBorders>
+              <w:top w:val="single" w:color="D9DBE6" w:sz="4"/>
+              <w:left w:val="single" w:color="D9DBE6" w:sz="4"/>
+              <w:bottom w:val="single" w:color="D9DBE6" w:sz="4"/>
+              <w:right w:val="single" w:color="D9DBE6" w:sz="4"/>
+            </w:tcBorders>
+            <w:shd w:fill="F5F5FA" w:val="clear"/>
+            <w:tcMar>
+              <w:top w:type="dxa" w:w="60"/>
+              <w:left w:type="dxa" w:w="100"/>
+              <w:bottom w:type="dxa" w:w="60"/>
+              <w:right w:type="dxa" w:w="100"/>
+            </w:tcMar>
+          </w:tcPr>
+          <w:p>
+            <w:pPr>
+              <w:spacing w:after="0"/>
+            </w:pPr>
+            <w:r>
+              <w:rPr>
+                <w:sz w:val="19"/>
+                <w:szCs w:val="19"/>
+              </w:rPr>
+              <w:t xml:space="preserve">One minute of guided breathing (4 s in, 4 s hold, 4 s out); optional and never recorded.</w:t>
             </w:r>
           </w:p>
         </w:tc>
@@ -9933,7 +9908,210 @@
         </w:trPr>
         <w:tc>
           <w:tcPr>
-            <w:tcW w:type="dxa" w:w="2187"/>
+            <w:tcW w:type="dxa" w:w="2568"/>
+            <w:tcBorders>
+              <w:top w:val="single" w:color="D9DBE6" w:sz="4"/>
+              <w:left w:val="single" w:color="D9DBE6" w:sz="4"/>
+              <w:bottom w:val="single" w:color="D9DBE6" w:sz="4"/>
+              <w:right w:val="single" w:color="D9DBE6" w:sz="4"/>
+            </w:tcBorders>
+            <w:tcMar>
+              <w:top w:type="dxa" w:w="60"/>
+              <w:left w:type="dxa" w:w="100"/>
+              <w:bottom w:type="dxa" w:w="60"/>
+              <w:right w:type="dxa" w:w="100"/>
+            </w:tcMar>
+          </w:tcPr>
+          <w:p>
+            <w:pPr>
+              <w:spacing w:after="0"/>
+            </w:pPr>
+            <w:r>
+              <w:rPr>
+                <w:b/>
+                <w:bCs/>
+                <w:sz w:val="19"/>
+                <w:szCs w:val="19"/>
+              </w:rPr>
+              <w:t xml:space="preserve">Add recovery time</w:t>
+            </w:r>
+          </w:p>
+        </w:tc>
+        <w:tc>
+          <w:tcPr>
+            <w:tcW w:type="dxa" w:w="7338"/>
+            <w:tcBorders>
+              <w:top w:val="single" w:color="D9DBE6" w:sz="4"/>
+              <w:left w:val="single" w:color="D9DBE6" w:sz="4"/>
+              <w:bottom w:val="single" w:color="D9DBE6" w:sz="4"/>
+              <w:right w:val="single" w:color="D9DBE6" w:sz="4"/>
+            </w:tcBorders>
+            <w:tcMar>
+              <w:top w:type="dxa" w:w="60"/>
+              <w:left w:type="dxa" w:w="100"/>
+              <w:bottom w:type="dxa" w:w="60"/>
+              <w:right w:type="dxa" w:w="100"/>
+            </w:tcMar>
+          </w:tcPr>
+          <w:p>
+            <w:pPr>
+              <w:spacing w:after="0"/>
+            </w:pPr>
+            <w:r>
+              <w:rPr>
+                <w:sz w:val="19"/>
+                <w:szCs w:val="19"/>
+              </w:rPr>
+              <w:t xml:space="preserve">Opens </w:t>
+            </w:r>
+            <w:r>
+              <w:rPr>
+                <w:i/>
+                <w:iCs/>
+                <w:sz w:val="19"/>
+                <w:szCs w:val="19"/>
+              </w:rPr>
+              <w:t xml:space="preserve">Protect recovery time</w:t>
+            </w:r>
+            <w:r>
+              <w:rPr>
+                <w:sz w:val="19"/>
+                <w:szCs w:val="19"/>
+              </w:rPr>
+              <w:t xml:space="preserve"> with free-time suggestions.</w:t>
+            </w:r>
+          </w:p>
+        </w:tc>
+      </w:tr>
+      <w:tr>
+        <w:trPr>
+          <w:cantSplit/>
+        </w:trPr>
+        <w:tc>
+          <w:tcPr>
+            <w:tcW w:type="dxa" w:w="2568"/>
+            <w:tcBorders>
+              <w:top w:val="single" w:color="D9DBE6" w:sz="4"/>
+              <w:left w:val="single" w:color="D9DBE6" w:sz="4"/>
+              <w:bottom w:val="single" w:color="D9DBE6" w:sz="4"/>
+              <w:right w:val="single" w:color="D9DBE6" w:sz="4"/>
+            </w:tcBorders>
+            <w:shd w:fill="F5F5FA" w:val="clear"/>
+            <w:tcMar>
+              <w:top w:type="dxa" w:w="60"/>
+              <w:left w:type="dxa" w:w="100"/>
+              <w:bottom w:type="dxa" w:w="60"/>
+              <w:right w:type="dxa" w:w="100"/>
+            </w:tcMar>
+          </w:tcPr>
+          <w:p>
+            <w:pPr>
+              <w:spacing w:after="0"/>
+            </w:pPr>
+            <w:r>
+              <w:rPr>
+                <w:sz w:val="19"/>
+                <w:szCs w:val="19"/>
+              </w:rPr>
+              <w:t xml:space="preserve">Slot card</w:t>
+            </w:r>
+          </w:p>
+        </w:tc>
+        <w:tc>
+          <w:tcPr>
+            <w:tcW w:type="dxa" w:w="7338"/>
+            <w:tcBorders>
+              <w:top w:val="single" w:color="D9DBE6" w:sz="4"/>
+              <w:left w:val="single" w:color="D9DBE6" w:sz="4"/>
+              <w:bottom w:val="single" w:color="D9DBE6" w:sz="4"/>
+              <w:right w:val="single" w:color="D9DBE6" w:sz="4"/>
+            </w:tcBorders>
+            <w:shd w:fill="F5F5FA" w:val="clear"/>
+            <w:tcMar>
+              <w:top w:type="dxa" w:w="60"/>
+              <w:left w:type="dxa" w:w="100"/>
+              <w:bottom w:type="dxa" w:w="60"/>
+              <w:right w:type="dxa" w:w="100"/>
+            </w:tcMar>
+          </w:tcPr>
+          <w:p>
+            <w:pPr>
+              <w:spacing w:after="0"/>
+            </w:pPr>
+            <w:r>
+              <w:rPr>
+                <w:i/>
+                <w:iCs/>
+                <w:sz w:val="19"/>
+                <w:szCs w:val="19"/>
+              </w:rPr>
+              <w:t xml:space="preserve">Protected time</w:t>
+            </w:r>
+            <w:r>
+              <w:rPr>
+                <w:sz w:val="19"/>
+                <w:szCs w:val="19"/>
+              </w:rPr>
+              <w:t xml:space="preserve">, the time, </w:t>
+            </w:r>
+            <w:r>
+              <w:rPr>
+                <w:b/>
+                <w:bCs/>
+                <w:sz w:val="19"/>
+                <w:szCs w:val="19"/>
+              </w:rPr>
+              <w:t xml:space="preserve">TIME RESERVED</w:t>
+            </w:r>
+            <w:r>
+              <w:rPr>
+                <w:sz w:val="19"/>
+                <w:szCs w:val="19"/>
+              </w:rPr>
+              <w:t xml:space="preserve">; </w:t>
+            </w:r>
+            <w:r>
+              <w:rPr>
+                <w:b/>
+                <w:bCs/>
+                <w:sz w:val="19"/>
+                <w:szCs w:val="19"/>
+              </w:rPr>
+              <w:t xml:space="preserve">⋮ Edit/Remove</w:t>
+            </w:r>
+            <w:r>
+              <w:rPr>
+                <w:sz w:val="19"/>
+                <w:szCs w:val="19"/>
+              </w:rPr>
+              <w:t xml:space="preserve">; </w:t>
+            </w:r>
+            <w:r>
+              <w:rPr>
+                <w:i/>
+                <w:iCs/>
+                <w:sz w:val="19"/>
+                <w:szCs w:val="19"/>
+              </w:rPr>
+              <w:t xml:space="preserve">Activity done</w:t>
+            </w:r>
+            <w:r>
+              <w:rPr>
+                <w:sz w:val="19"/>
+                <w:szCs w:val="19"/>
+              </w:rPr>
+              <w:t xml:space="preserve"> once it has started.</w:t>
+            </w:r>
+          </w:p>
+        </w:tc>
+      </w:tr>
+      <w:tr>
+        <w:trPr>
+          <w:cantSplit/>
+        </w:trPr>
+        <w:tc>
+          <w:tcPr>
+            <w:tcW w:type="dxa" w:w="2568"/>
             <w:tcBorders>
               <w:top w:val="single" w:color="D9DBE6" w:sz="4"/>
               <w:left w:val="single" w:color="D9DBE6" w:sz="4"/>
@@ -9962,7 +10140,7 @@
         </w:tc>
         <w:tc>
           <w:tcPr>
-            <w:tcW w:type="dxa" w:w="7719"/>
+            <w:tcW w:type="dxa" w:w="7338"/>
             <w:tcBorders>
               <w:top w:val="single" w:color="D9DBE6" w:sz="4"/>
               <w:left w:val="single" w:color="D9DBE6" w:sz="4"/>

</xml_diff>

<commit_message>
Docs: README, release notes, user guide and test map brought up to date (422 tests, 92.5%; icon, animations, rest camp, fixes)
</commit_message>
<xml_diff>
--- a/docs/Balance_User_Guide.docx
+++ b/docs/Balance_User_Guide.docx
@@ -1576,7 +1576,7 @@
             <w:pPr>
               <w:spacing w:after="0"/>
             </w:pPr>
-            <w:hyperlink w:history="1" r:id="rIdkdsosv2jbputm5u8qwzqz">
+            <w:hyperlink w:history="1" r:id="rIdoqdz8jumdmzwz7yrjzqtr">
               <w:r>
                 <w:rPr>
                   <w:rStyle w:val="Hyperlink"/>
@@ -4455,7 +4455,27 @@
         <w:t xml:space="preserve">Plan confirmed</w:t>
       </w:r>
       <w:r>
-        <w:t xml:space="preserve"> lists what moved and offers </w:t>
+        <w:t xml:space="preserve"> draws a tick, and a card slides from </w:t>
+      </w:r>
+      <w:r>
+        <w:rPr>
+          <w:i/>
+          <w:iCs/>
+        </w:rPr>
+        <w:t xml:space="preserve">Overloaded day</w:t>
+      </w:r>
+      <w:r>
+        <w:t xml:space="preserve"> to </w:t>
+      </w:r>
+      <w:r>
+        <w:rPr>
+          <w:i/>
+          <w:iCs/>
+        </w:rPr>
+        <w:t xml:space="preserve">Day with room</w:t>
+      </w:r>
+      <w:r>
+        <w:t xml:space="preserve"> to show the move. Below, it lists what moved and offers </w:t>
       </w:r>
       <w:r>
         <w:rPr>
@@ -4829,7 +4849,7 @@
         <w:t xml:space="preserve">Changes were undone</w:t>
       </w:r>
       <w:r>
-        <w:t xml:space="preserve"> confirms the task was restored. On </w:t>
+        <w:t xml:space="preserve"> confirms the task was restored (the card slides back). On </w:t>
       </w:r>
       <w:r>
         <w:rPr>

</xml_diff>

<commit_message>
Release v1.0.1: custom reminder lead times; version 1.0.1+2
</commit_message>
<xml_diff>
--- a/docs/Balance_User_Guide.docx
+++ b/docs/Balance_User_Guide.docx
@@ -1576,7 +1576,7 @@
             <w:pPr>
               <w:spacing w:after="0"/>
             </w:pPr>
-            <w:hyperlink w:history="1" r:id="rIdoqdz8jumdmzwz7yrjzqtr">
+            <w:hyperlink w:history="1" r:id="rIdapud5rbrv3teav9t-7lx9">
               <w:r>
                 <w:rPr>
                   <w:rStyle w:val="Hyperlink"/>
@@ -6186,7 +6186,17 @@
         <w:t xml:space="preserve">Deadline reminders</w:t>
       </w:r>
       <w:r>
-        <w:t xml:space="preserve"> — a reminder a set time before each task deadline.</w:t>
+        <w:t xml:space="preserve"> — a reminder a set time before each task deadline: 15 minutes, 30 minutes, 1 hour, 1 day, or </w:t>
+      </w:r>
+      <w:r>
+        <w:rPr>
+          <w:b/>
+          <w:bCs/>
+        </w:rPr>
+        <w:t xml:space="preserve">Custom minutes…</w:t>
+      </w:r>
+      <w:r>
+        <w:t xml:space="preserve"> (1 to 10080 minutes).</w:t>
       </w:r>
     </w:p>
     <w:p>

</xml_diff>

<commit_message>
Release v1.0.3: smarter Council; version 1.0.3+4
</commit_message>
<xml_diff>
--- a/docs/Balance_User_Guide.docx
+++ b/docs/Balance_User_Guide.docx
@@ -1576,7 +1576,7 @@
             <w:pPr>
               <w:spacing w:after="0"/>
             </w:pPr>
-            <w:hyperlink w:history="1" r:id="rIdapud5rbrv3teav9t-7lx9">
+            <w:hyperlink w:history="1" r:id="rIddbi7awqxqkdym-nlntdhg">
               <w:r>
                 <w:rPr>
                   <w:rStyle w:val="Hyperlink"/>
@@ -9335,12 +9335,10 @@
             </w:pPr>
             <w:r>
               <w:rPr>
-                <w:b/>
-                <w:bCs/>
-                <w:sz w:val="19"/>
-                <w:szCs w:val="19"/>
-              </w:rPr>
-              <w:t xml:space="preserve">What stays protected</w:t>
+                <w:sz w:val="19"/>
+                <w:szCs w:val="19"/>
+              </w:rPr>
+              <w:t xml:space="preserve">How Council decides</w:t>
             </w:r>
           </w:p>
         </w:tc>
@@ -9370,7 +9368,7 @@
                 <w:sz w:val="19"/>
                 <w:szCs w:val="19"/>
               </w:rPr>
-              <w:t xml:space="preserve">Fixed and protected tasks and protected recovery that will not move.</w:t>
+              <w:t xml:space="preserve">It moves only flexible work (scheduled on the day, or due on it without a start time), whole or in part, into free time on another day before the deadline. Fixed and protected tasks and protected rest never move; one plan moves at most three tasks.</w:t>
             </w:r>
           </w:p>
         </w:tc>
@@ -9401,55 +9399,41 @@
             </w:pPr>
             <w:r>
               <w:rPr>
-                <w:sz w:val="19"/>
-                <w:szCs w:val="19"/>
-              </w:rPr>
-              <w:t xml:space="preserve">Option card</w:t>
-            </w:r>
-          </w:p>
-        </w:tc>
-        <w:tc>
-          <w:tcPr>
-            <w:tcW w:type="dxa" w:w="7338"/>
-            <w:tcBorders>
-              <w:top w:val="single" w:color="D9DBE6" w:sz="4"/>
-              <w:left w:val="single" w:color="D9DBE6" w:sz="4"/>
-              <w:bottom w:val="single" w:color="D9DBE6" w:sz="4"/>
-              <w:right w:val="single" w:color="D9DBE6" w:sz="4"/>
-            </w:tcBorders>
-            <w:tcMar>
-              <w:top w:type="dxa" w:w="60"/>
-              <w:left w:type="dxa" w:w="100"/>
-              <w:bottom w:type="dxa" w:w="60"/>
-              <w:right w:type="dxa" w:w="100"/>
-            </w:tcMar>
-          </w:tcPr>
-          <w:p>
-            <w:pPr>
-              <w:spacing w:after="0"/>
-            </w:pPr>
-            <w:r>
-              <w:rPr>
-                <w:sz w:val="19"/>
-                <w:szCs w:val="19"/>
-              </w:rPr>
-              <w:t xml:space="preserve">What moves, where and when; </w:t>
-            </w:r>
-            <w:r>
-              <w:rPr>
                 <w:b/>
                 <w:bCs/>
                 <w:sz w:val="19"/>
                 <w:szCs w:val="19"/>
               </w:rPr>
-              <w:t xml:space="preserve">See trade-offs</w:t>
-            </w:r>
-            <w:r>
-              <w:rPr>
-                <w:sz w:val="19"/>
-                <w:szCs w:val="19"/>
-              </w:rPr>
-              <w:t xml:space="preserve"> shows cost, protection, room created and checks.</w:t>
+              <w:t xml:space="preserve">What stays protected</w:t>
+            </w:r>
+          </w:p>
+        </w:tc>
+        <w:tc>
+          <w:tcPr>
+            <w:tcW w:type="dxa" w:w="7338"/>
+            <w:tcBorders>
+              <w:top w:val="single" w:color="D9DBE6" w:sz="4"/>
+              <w:left w:val="single" w:color="D9DBE6" w:sz="4"/>
+              <w:bottom w:val="single" w:color="D9DBE6" w:sz="4"/>
+              <w:right w:val="single" w:color="D9DBE6" w:sz="4"/>
+            </w:tcBorders>
+            <w:tcMar>
+              <w:top w:type="dxa" w:w="60"/>
+              <w:left w:type="dxa" w:w="100"/>
+              <w:bottom w:type="dxa" w:w="60"/>
+              <w:right w:type="dxa" w:w="100"/>
+            </w:tcMar>
+          </w:tcPr>
+          <w:p>
+            <w:pPr>
+              <w:spacing w:after="0"/>
+            </w:pPr>
+            <w:r>
+              <w:rPr>
+                <w:sz w:val="19"/>
+                <w:szCs w:val="19"/>
+              </w:rPr>
+              <w:t xml:space="preserve">Fixed and protected tasks and protected recovery that will not move.</w:t>
             </w:r>
           </w:p>
         </w:tc>
@@ -9481,42 +9465,56 @@
             </w:pPr>
             <w:r>
               <w:rPr>
+                <w:sz w:val="19"/>
+                <w:szCs w:val="19"/>
+              </w:rPr>
+              <w:t xml:space="preserve">Option card</w:t>
+            </w:r>
+          </w:p>
+        </w:tc>
+        <w:tc>
+          <w:tcPr>
+            <w:tcW w:type="dxa" w:w="7338"/>
+            <w:tcBorders>
+              <w:top w:val="single" w:color="D9DBE6" w:sz="4"/>
+              <w:left w:val="single" w:color="D9DBE6" w:sz="4"/>
+              <w:bottom w:val="single" w:color="D9DBE6" w:sz="4"/>
+              <w:right w:val="single" w:color="D9DBE6" w:sz="4"/>
+            </w:tcBorders>
+            <w:shd w:fill="F5F5FA" w:val="clear"/>
+            <w:tcMar>
+              <w:top w:type="dxa" w:w="60"/>
+              <w:left w:type="dxa" w:w="100"/>
+              <w:bottom w:type="dxa" w:w="60"/>
+              <w:right w:type="dxa" w:w="100"/>
+            </w:tcMar>
+          </w:tcPr>
+          <w:p>
+            <w:pPr>
+              <w:spacing w:after="0"/>
+            </w:pPr>
+            <w:r>
+              <w:rPr>
+                <w:sz w:val="19"/>
+                <w:szCs w:val="19"/>
+              </w:rPr>
+              <w:t xml:space="preserve">What moves, where and when; </w:t>
+            </w:r>
+            <w:r>
+              <w:rPr>
                 <w:b/>
                 <w:bCs/>
                 <w:sz w:val="19"/>
                 <w:szCs w:val="19"/>
               </w:rPr>
-              <w:t xml:space="preserve">Confirm selected plan</w:t>
-            </w:r>
-          </w:p>
-        </w:tc>
-        <w:tc>
-          <w:tcPr>
-            <w:tcW w:type="dxa" w:w="7338"/>
-            <w:tcBorders>
-              <w:top w:val="single" w:color="D9DBE6" w:sz="4"/>
-              <w:left w:val="single" w:color="D9DBE6" w:sz="4"/>
-              <w:bottom w:val="single" w:color="D9DBE6" w:sz="4"/>
-              <w:right w:val="single" w:color="D9DBE6" w:sz="4"/>
-            </w:tcBorders>
-            <w:shd w:fill="F5F5FA" w:val="clear"/>
-            <w:tcMar>
-              <w:top w:type="dxa" w:w="60"/>
-              <w:left w:type="dxa" w:w="100"/>
-              <w:bottom w:type="dxa" w:w="60"/>
-              <w:right w:type="dxa" w:w="100"/>
-            </w:tcMar>
-          </w:tcPr>
-          <w:p>
-            <w:pPr>
-              <w:spacing w:after="0"/>
-            </w:pPr>
-            <w:r>
-              <w:rPr>
-                <w:sz w:val="19"/>
-                <w:szCs w:val="19"/>
-              </w:rPr>
-              <w:t xml:space="preserve">Saves the selected option after the server re-checks it.</w:t>
+              <w:t xml:space="preserve">See trade-offs</w:t>
+            </w:r>
+            <w:r>
+              <w:rPr>
+                <w:sz w:val="19"/>
+                <w:szCs w:val="19"/>
+              </w:rPr>
+              <w:t xml:space="preserve"> shows cost, protection, room created and checks.</w:t>
             </w:r>
           </w:p>
         </w:tc>
@@ -9547,73 +9545,41 @@
             </w:pPr>
             <w:r>
               <w:rPr>
-                <w:i/>
-                <w:iCs/>
-                <w:sz w:val="19"/>
-                <w:szCs w:val="19"/>
-              </w:rPr>
-              <w:t xml:space="preserve">No safe move found</w:t>
-            </w:r>
-          </w:p>
-        </w:tc>
-        <w:tc>
-          <w:tcPr>
-            <w:tcW w:type="dxa" w:w="7338"/>
-            <w:tcBorders>
-              <w:top w:val="single" w:color="D9DBE6" w:sz="4"/>
-              <w:left w:val="single" w:color="D9DBE6" w:sz="4"/>
-              <w:bottom w:val="single" w:color="D9DBE6" w:sz="4"/>
-              <w:right w:val="single" w:color="D9DBE6" w:sz="4"/>
-            </w:tcBorders>
-            <w:tcMar>
-              <w:top w:type="dxa" w:w="60"/>
-              <w:left w:type="dxa" w:w="100"/>
-              <w:bottom w:type="dxa" w:w="60"/>
-              <w:right w:type="dxa" w:w="100"/>
-            </w:tcMar>
-          </w:tcPr>
-          <w:p>
-            <w:pPr>
-              <w:spacing w:after="0"/>
-            </w:pPr>
-            <w:r>
-              <w:rPr>
-                <w:sz w:val="19"/>
-                <w:szCs w:val="19"/>
-              </w:rPr>
-              <w:t xml:space="preserve">Explains why (for example a task with no start time, or recovery time using the only free time) and offers </w:t>
-            </w:r>
-            <w:r>
-              <w:rPr>
                 <w:b/>
                 <w:bCs/>
                 <w:sz w:val="19"/>
                 <w:szCs w:val="19"/>
               </w:rPr>
-              <w:t xml:space="preserve">Review tasks</w:t>
-            </w:r>
-            <w:r>
-              <w:rPr>
-                <w:sz w:val="19"/>
-                <w:szCs w:val="19"/>
-              </w:rPr>
-              <w:t xml:space="preserve"> or </w:t>
-            </w:r>
-            <w:r>
-              <w:rPr>
-                <w:b/>
-                <w:bCs/>
-                <w:sz w:val="19"/>
-                <w:szCs w:val="19"/>
-              </w:rPr>
-              <w:t xml:space="preserve">Add free time on Today</w:t>
-            </w:r>
-            <w:r>
-              <w:rPr>
-                <w:sz w:val="19"/>
-                <w:szCs w:val="19"/>
-              </w:rPr>
-              <w:t xml:space="preserve">.</w:t>
+              <w:t xml:space="preserve">Confirm selected plan</w:t>
+            </w:r>
+          </w:p>
+        </w:tc>
+        <w:tc>
+          <w:tcPr>
+            <w:tcW w:type="dxa" w:w="7338"/>
+            <w:tcBorders>
+              <w:top w:val="single" w:color="D9DBE6" w:sz="4"/>
+              <w:left w:val="single" w:color="D9DBE6" w:sz="4"/>
+              <w:bottom w:val="single" w:color="D9DBE6" w:sz="4"/>
+              <w:right w:val="single" w:color="D9DBE6" w:sz="4"/>
+            </w:tcBorders>
+            <w:tcMar>
+              <w:top w:type="dxa" w:w="60"/>
+              <w:left w:type="dxa" w:w="100"/>
+              <w:bottom w:type="dxa" w:w="60"/>
+              <w:right w:type="dxa" w:w="100"/>
+            </w:tcMar>
+          </w:tcPr>
+          <w:p>
+            <w:pPr>
+              <w:spacing w:after="0"/>
+            </w:pPr>
+            <w:r>
+              <w:rPr>
+                <w:sz w:val="19"/>
+                <w:szCs w:val="19"/>
+              </w:rPr>
+              <w:t xml:space="preserve">Saves the selected option after the server re-checks it.</w:t>
             </w:r>
           </w:p>
         </w:tc>
@@ -9645,11 +9611,141 @@
             </w:pPr>
             <w:r>
               <w:rPr>
+                <w:i/>
+                <w:iCs/>
+                <w:sz w:val="19"/>
+                <w:szCs w:val="19"/>
+              </w:rPr>
+              <w:t xml:space="preserve">No safe move found</w:t>
+            </w:r>
+          </w:p>
+        </w:tc>
+        <w:tc>
+          <w:tcPr>
+            <w:tcW w:type="dxa" w:w="7338"/>
+            <w:tcBorders>
+              <w:top w:val="single" w:color="D9DBE6" w:sz="4"/>
+              <w:left w:val="single" w:color="D9DBE6" w:sz="4"/>
+              <w:bottom w:val="single" w:color="D9DBE6" w:sz="4"/>
+              <w:right w:val="single" w:color="D9DBE6" w:sz="4"/>
+            </w:tcBorders>
+            <w:shd w:fill="F5F5FA" w:val="clear"/>
+            <w:tcMar>
+              <w:top w:type="dxa" w:w="60"/>
+              <w:left w:type="dxa" w:w="100"/>
+              <w:bottom w:type="dxa" w:w="60"/>
+              <w:right w:type="dxa" w:w="100"/>
+            </w:tcMar>
+          </w:tcPr>
+          <w:p>
+            <w:pPr>
+              <w:spacing w:after="0"/>
+            </w:pPr>
+            <w:r>
+              <w:rPr>
+                <w:sz w:val="19"/>
+                <w:szCs w:val="19"/>
+              </w:rPr>
+              <w:t xml:space="preserve">Explains why (for example work due on this day with no other day to move to, or recovery time using the only free time). When extra free time would help, it says how much and on which day (</w:t>
+            </w:r>
+            <w:r>
+              <w:rPr>
+                <w:i/>
+                <w:iCs/>
+                <w:sz w:val="19"/>
+                <w:szCs w:val="19"/>
+              </w:rPr>
+              <w:t xml:space="preserve">Add 2h of free time on Wed 14 Oct …</w:t>
+            </w:r>
+            <w:r>
+              <w:rPr>
+                <w:sz w:val="19"/>
+                <w:szCs w:val="19"/>
+              </w:rPr>
+              <w:t xml:space="preserve">) with an </w:t>
+            </w:r>
+            <w:r>
+              <w:rPr>
                 <w:b/>
                 <w:bCs/>
                 <w:sz w:val="19"/>
                 <w:szCs w:val="19"/>
               </w:rPr>
+              <w:t xml:space="preserve">Add free time on …</w:t>
+            </w:r>
+            <w:r>
+              <w:rPr>
+                <w:sz w:val="19"/>
+                <w:szCs w:val="19"/>
+              </w:rPr>
+              <w:t xml:space="preserve"> button. Tasks that block the plan have </w:t>
+            </w:r>
+            <w:r>
+              <w:rPr>
+                <w:b/>
+                <w:bCs/>
+                <w:sz w:val="19"/>
+                <w:szCs w:val="19"/>
+              </w:rPr>
+              <w:t xml:space="preserve">Edit task</w:t>
+            </w:r>
+            <w:r>
+              <w:rPr>
+                <w:sz w:val="19"/>
+                <w:szCs w:val="19"/>
+              </w:rPr>
+              <w:t xml:space="preserve"> (change the deadline or minutes); </w:t>
+            </w:r>
+            <w:r>
+              <w:rPr>
+                <w:b/>
+                <w:bCs/>
+                <w:sz w:val="19"/>
+                <w:szCs w:val="19"/>
+              </w:rPr>
+              <w:t xml:space="preserve">Review tasks</w:t>
+            </w:r>
+            <w:r>
+              <w:rPr>
+                <w:sz w:val="19"/>
+                <w:szCs w:val="19"/>
+              </w:rPr>
+              <w:t xml:space="preserve"> opens Quests.</w:t>
+            </w:r>
+          </w:p>
+        </w:tc>
+      </w:tr>
+      <w:tr>
+        <w:trPr>
+          <w:cantSplit/>
+        </w:trPr>
+        <w:tc>
+          <w:tcPr>
+            <w:tcW w:type="dxa" w:w="2568"/>
+            <w:tcBorders>
+              <w:top w:val="single" w:color="D9DBE6" w:sz="4"/>
+              <w:left w:val="single" w:color="D9DBE6" w:sz="4"/>
+              <w:bottom w:val="single" w:color="D9DBE6" w:sz="4"/>
+              <w:right w:val="single" w:color="D9DBE6" w:sz="4"/>
+            </w:tcBorders>
+            <w:tcMar>
+              <w:top w:type="dxa" w:w="60"/>
+              <w:left w:type="dxa" w:w="100"/>
+              <w:bottom w:type="dxa" w:w="60"/>
+              <w:right w:type="dxa" w:w="100"/>
+            </w:tcMar>
+          </w:tcPr>
+          <w:p>
+            <w:pPr>
+              <w:spacing w:after="0"/>
+            </w:pPr>
+            <w:r>
+              <w:rPr>
+                <w:b/>
+                <w:bCs/>
+                <w:sz w:val="19"/>
+                <w:szCs w:val="19"/>
+              </w:rPr>
               <w:t xml:space="preserve">Plan history</w:t>
             </w:r>
           </w:p>
@@ -9663,7 +9759,6 @@
               <w:bottom w:val="single" w:color="D9DBE6" w:sz="4"/>
               <w:right w:val="single" w:color="D9DBE6" w:sz="4"/>
             </w:tcBorders>
-            <w:shd w:fill="F5F5FA" w:val="clear"/>
             <w:tcMar>
               <w:top w:type="dxa" w:w="60"/>
               <w:left w:type="dxa" w:w="100"/>
@@ -12774,7 +12869,7 @@
                 <w:sz w:val="19"/>
                 <w:szCs w:val="19"/>
               </w:rPr>
-              <w:t xml:space="preserve"> on the sample day</w:t>
+              <w:t xml:space="preserve"> on your own day</w:t>
             </w:r>
           </w:p>
         </w:tc>
@@ -12804,7 +12899,23 @@
                 <w:sz w:val="19"/>
                 <w:szCs w:val="19"/>
               </w:rPr>
-              <w:t xml:space="preserve">A recovery slot is using the next day's free time; the explanation names it. Remove it in </w:t>
+              <w:t xml:space="preserve">Read </w:t>
+            </w:r>
+            <w:r>
+              <w:rPr>
+                <w:i/>
+                <w:iCs/>
+                <w:sz w:val="19"/>
+                <w:szCs w:val="19"/>
+              </w:rPr>
+              <w:t xml:space="preserve">Why</w:t>
+            </w:r>
+            <w:r>
+              <w:rPr>
+                <w:sz w:val="19"/>
+                <w:szCs w:val="19"/>
+              </w:rPr>
+              <w:t xml:space="preserve">. Most often there is not enough free time on another day before the deadline: tap </w:t>
             </w:r>
             <w:r>
               <w:rPr>
@@ -12813,14 +12924,30 @@
                 <w:sz w:val="19"/>
                 <w:szCs w:val="19"/>
               </w:rPr>
-              <w:t xml:space="preserve">SANCTUARY</w:t>
-            </w:r>
-            <w:r>
-              <w:rPr>
-                <w:sz w:val="19"/>
-                <w:szCs w:val="19"/>
-              </w:rPr>
-              <w:t xml:space="preserve"> (step 6.5).</w:t>
+              <w:t xml:space="preserve">Add free time on …</w:t>
+            </w:r>
+            <w:r>
+              <w:rPr>
+                <w:sz w:val="19"/>
+                <w:szCs w:val="19"/>
+              </w:rPr>
+              <w:t xml:space="preserve"> for the day Council names. If the work is due on that same day, ask for a later deadline or tap </w:t>
+            </w:r>
+            <w:r>
+              <w:rPr>
+                <w:b/>
+                <w:bCs/>
+                <w:sz w:val="19"/>
+                <w:szCs w:val="19"/>
+              </w:rPr>
+              <w:t xml:space="preserve">Edit task</w:t>
+            </w:r>
+            <w:r>
+              <w:rPr>
+                <w:sz w:val="19"/>
+                <w:szCs w:val="19"/>
+              </w:rPr>
+              <w:t xml:space="preserve"> if it can take less time. Fixed and protected work never moves, by design.</w:t>
             </w:r>
           </w:p>
         </w:tc>
@@ -12854,36 +12981,7 @@
                 <w:sz w:val="19"/>
                 <w:szCs w:val="19"/>
               </w:rPr>
-              <w:t xml:space="preserve">The beginner guide does not appear</w:t>
-            </w:r>
-          </w:p>
-        </w:tc>
-        <w:tc>
-          <w:tcPr>
-            <w:tcW w:type="dxa" w:w="4953"/>
-            <w:tcBorders>
-              <w:top w:val="single" w:color="D9DBE6" w:sz="4"/>
-              <w:left w:val="single" w:color="D9DBE6" w:sz="4"/>
-              <w:bottom w:val="single" w:color="D9DBE6" w:sz="4"/>
-              <w:right w:val="single" w:color="D9DBE6" w:sz="4"/>
-            </w:tcBorders>
-            <w:tcMar>
-              <w:top w:type="dxa" w:w="60"/>
-              <w:left w:type="dxa" w:w="100"/>
-              <w:bottom w:type="dxa" w:w="60"/>
-              <w:right w:type="dxa" w:w="100"/>
-            </w:tcMar>
-          </w:tcPr>
-          <w:p>
-            <w:pPr>
-              <w:spacing w:after="0"/>
-            </w:pPr>
-            <w:r>
-              <w:rPr>
-                <w:sz w:val="19"/>
-                <w:szCs w:val="19"/>
-              </w:rPr>
-              <w:t xml:space="preserve">It shows once per phone. Open </w:t>
+              <w:t xml:space="preserve">Council shows </w:t>
             </w:r>
             <w:r>
               <w:rPr>
@@ -12892,14 +12990,59 @@
                 <w:sz w:val="19"/>
                 <w:szCs w:val="19"/>
               </w:rPr>
-              <w:t xml:space="preserve">Profile → Beginner guide</w:t>
-            </w:r>
-            <w:r>
-              <w:rPr>
-                <w:sz w:val="19"/>
-                <w:szCs w:val="19"/>
-              </w:rPr>
-              <w:t xml:space="preserve">.</w:t>
+              <w:t xml:space="preserve">No Feasible Plan</w:t>
+            </w:r>
+            <w:r>
+              <w:rPr>
+                <w:sz w:val="19"/>
+                <w:szCs w:val="19"/>
+              </w:rPr>
+              <w:t xml:space="preserve"> on the sample day</w:t>
+            </w:r>
+          </w:p>
+        </w:tc>
+        <w:tc>
+          <w:tcPr>
+            <w:tcW w:type="dxa" w:w="4953"/>
+            <w:tcBorders>
+              <w:top w:val="single" w:color="D9DBE6" w:sz="4"/>
+              <w:left w:val="single" w:color="D9DBE6" w:sz="4"/>
+              <w:bottom w:val="single" w:color="D9DBE6" w:sz="4"/>
+              <w:right w:val="single" w:color="D9DBE6" w:sz="4"/>
+            </w:tcBorders>
+            <w:tcMar>
+              <w:top w:type="dxa" w:w="60"/>
+              <w:left w:type="dxa" w:w="100"/>
+              <w:bottom w:type="dxa" w:w="60"/>
+              <w:right w:type="dxa" w:w="100"/>
+            </w:tcMar>
+          </w:tcPr>
+          <w:p>
+            <w:pPr>
+              <w:spacing w:after="0"/>
+            </w:pPr>
+            <w:r>
+              <w:rPr>
+                <w:sz w:val="19"/>
+                <w:szCs w:val="19"/>
+              </w:rPr>
+              <w:t xml:space="preserve">A recovery slot is using the next day's free time; the explanation names it. Remove it in </w:t>
+            </w:r>
+            <w:r>
+              <w:rPr>
+                <w:b/>
+                <w:bCs/>
+                <w:sz w:val="19"/>
+                <w:szCs w:val="19"/>
+              </w:rPr>
+              <w:t xml:space="preserve">SANCTUARY</w:t>
+            </w:r>
+            <w:r>
+              <w:rPr>
+                <w:sz w:val="19"/>
+                <w:szCs w:val="19"/>
+              </w:rPr>
+              <w:t xml:space="preserve"> (step 6.5).</w:t>
             </w:r>
           </w:p>
         </w:tc>
@@ -12934,7 +13077,7 @@
                 <w:sz w:val="19"/>
                 <w:szCs w:val="19"/>
               </w:rPr>
-              <w:t xml:space="preserve">No sound</w:t>
+              <w:t xml:space="preserve">The beginner guide does not appear</w:t>
             </w:r>
           </w:p>
         </w:tc>
@@ -12964,7 +13107,7 @@
                 <w:sz w:val="19"/>
                 <w:szCs w:val="19"/>
               </w:rPr>
-              <w:t xml:space="preserve">Check that the music note at the top of the page is gold, </w:t>
+              <w:t xml:space="preserve">It shows once per phone. Open </w:t>
             </w:r>
             <w:r>
               <w:rPr>
@@ -12973,14 +13116,14 @@
                 <w:sz w:val="19"/>
                 <w:szCs w:val="19"/>
               </w:rPr>
-              <w:t xml:space="preserve">Profile → Sound effects</w:t>
-            </w:r>
-            <w:r>
-              <w:rPr>
-                <w:sz w:val="19"/>
-                <w:szCs w:val="19"/>
-              </w:rPr>
-              <w:t xml:space="preserve">, and the phone's media volume.</w:t>
+              <w:t xml:space="preserve">Profile → Beginner guide</w:t>
+            </w:r>
+            <w:r>
+              <w:rPr>
+                <w:sz w:val="19"/>
+                <w:szCs w:val="19"/>
+              </w:rPr>
+              <w:t xml:space="preserve">.</w:t>
             </w:r>
           </w:p>
         </w:tc>
@@ -13014,7 +13157,7 @@
                 <w:sz w:val="19"/>
                 <w:szCs w:val="19"/>
               </w:rPr>
-              <w:t xml:space="preserve">Music is playing and you want quiet</w:t>
+              <w:t xml:space="preserve">No sound</w:t>
             </w:r>
           </w:p>
         </w:tc>
@@ -13043,7 +13186,23 @@
                 <w:sz w:val="19"/>
                 <w:szCs w:val="19"/>
               </w:rPr>
-              <w:t xml:space="preserve">Tap the gold music note at the top of any main page.</w:t>
+              <w:t xml:space="preserve">Check that the music note at the top of the page is gold, </w:t>
+            </w:r>
+            <w:r>
+              <w:rPr>
+                <w:b/>
+                <w:bCs/>
+                <w:sz w:val="19"/>
+                <w:szCs w:val="19"/>
+              </w:rPr>
+              <w:t xml:space="preserve">Profile → Sound effects</w:t>
+            </w:r>
+            <w:r>
+              <w:rPr>
+                <w:sz w:val="19"/>
+                <w:szCs w:val="19"/>
+              </w:rPr>
+              <w:t xml:space="preserve">, and the phone's media volume.</w:t>
             </w:r>
           </w:p>
         </w:tc>
@@ -13078,7 +13237,7 @@
                 <w:sz w:val="19"/>
                 <w:szCs w:val="19"/>
               </w:rPr>
-              <w:t xml:space="preserve">Sign-in fails</w:t>
+              <w:t xml:space="preserve">Music is playing and you want quiet</w:t>
             </w:r>
           </w:p>
         </w:tc>
@@ -13108,7 +13267,7 @@
                 <w:sz w:val="19"/>
                 <w:szCs w:val="19"/>
               </w:rPr>
-              <w:t xml:space="preserve">Check the email and password from the submission form for typing errors.</w:t>
+              <w:t xml:space="preserve">Tap the gold music note at the top of any main page.</w:t>
             </w:r>
           </w:p>
         </w:tc>
@@ -13142,6 +13301,70 @@
                 <w:sz w:val="19"/>
                 <w:szCs w:val="19"/>
               </w:rPr>
+              <w:t xml:space="preserve">Sign-in fails</w:t>
+            </w:r>
+          </w:p>
+        </w:tc>
+        <w:tc>
+          <w:tcPr>
+            <w:tcW w:type="dxa" w:w="4953"/>
+            <w:tcBorders>
+              <w:top w:val="single" w:color="D9DBE6" w:sz="4"/>
+              <w:left w:val="single" w:color="D9DBE6" w:sz="4"/>
+              <w:bottom w:val="single" w:color="D9DBE6" w:sz="4"/>
+              <w:right w:val="single" w:color="D9DBE6" w:sz="4"/>
+            </w:tcBorders>
+            <w:tcMar>
+              <w:top w:type="dxa" w:w="60"/>
+              <w:left w:type="dxa" w:w="100"/>
+              <w:bottom w:type="dxa" w:w="60"/>
+              <w:right w:type="dxa" w:w="100"/>
+            </w:tcMar>
+          </w:tcPr>
+          <w:p>
+            <w:pPr>
+              <w:spacing w:after="0"/>
+            </w:pPr>
+            <w:r>
+              <w:rPr>
+                <w:sz w:val="19"/>
+                <w:szCs w:val="19"/>
+              </w:rPr>
+              <w:t xml:space="preserve">Check the email and password from the submission form for typing errors.</w:t>
+            </w:r>
+          </w:p>
+        </w:tc>
+      </w:tr>
+      <w:tr>
+        <w:trPr>
+          <w:cantSplit/>
+        </w:trPr>
+        <w:tc>
+          <w:tcPr>
+            <w:tcW w:type="dxa" w:w="4953"/>
+            <w:tcBorders>
+              <w:top w:val="single" w:color="D9DBE6" w:sz="4"/>
+              <w:left w:val="single" w:color="D9DBE6" w:sz="4"/>
+              <w:bottom w:val="single" w:color="D9DBE6" w:sz="4"/>
+              <w:right w:val="single" w:color="D9DBE6" w:sz="4"/>
+            </w:tcBorders>
+            <w:shd w:fill="F5F5FA" w:val="clear"/>
+            <w:tcMar>
+              <w:top w:type="dxa" w:w="60"/>
+              <w:left w:type="dxa" w:w="100"/>
+              <w:bottom w:type="dxa" w:w="60"/>
+              <w:right w:type="dxa" w:w="100"/>
+            </w:tcMar>
+          </w:tcPr>
+          <w:p>
+            <w:pPr>
+              <w:spacing w:after="0"/>
+            </w:pPr>
+            <w:r>
+              <w:rPr>
+                <w:sz w:val="19"/>
+                <w:szCs w:val="19"/>
+              </w:rPr>
               <w:t xml:space="preserve">"Can't install app"</w:t>
             </w:r>
           </w:p>
@@ -13155,6 +13378,7 @@
               <w:bottom w:val="single" w:color="D9DBE6" w:sz="4"/>
               <w:right w:val="single" w:color="D9DBE6" w:sz="4"/>
             </w:tcBorders>
+            <w:shd w:fill="F5F5FA" w:val="clear"/>
             <w:tcMar>
               <w:top w:type="dxa" w:w="60"/>
               <w:left w:type="dxa" w:w="100"/>

</xml_diff>

<commit_message>
User guide for v1.0.4: plan-history delete note, 7-day free-time message, version line; PDF and Word regenerated; test map runs
</commit_message>
<xml_diff>
--- a/docs/Balance_User_Guide.docx
+++ b/docs/Balance_User_Guide.docx
@@ -34,7 +34,38 @@
         <w:t xml:space="preserve">Help needed:</w:t>
       </w:r>
       <w:r>
-        <w:t xml:space="preserve"> none.</w:t>
+        <w:t xml:space="preserve"> none. </w:t>
+      </w:r>
+      <w:r>
+        <w:rPr>
+          <w:b/>
+          <w:bCs/>
+        </w:rPr>
+        <w:t xml:space="preserve">App version:</w:t>
+      </w:r>
+      <w:r>
+        <w:t xml:space="preserve"> this guide matches Balance </w:t>
+      </w:r>
+      <w:r>
+        <w:rPr>
+          <w:b/>
+          <w:bCs/>
+        </w:rPr>
+        <w:t xml:space="preserve">v1.0.4</w:t>
+      </w:r>
+      <w:r>
+        <w:t xml:space="preserve"> (13 October 2026), the </w:t>
+      </w:r>
+      <w:hyperlink w:history="1" r:id="rId9tk4w5im4rdurnrzc565g">
+        <w:r>
+          <w:rPr>
+            <w:rStyle w:val="Hyperlink"/>
+          </w:rPr>
+          <w:t xml:space="preserve">latest release</w:t>
+        </w:r>
+      </w:hyperlink>
+      <w:r>
+        <w:t xml:space="preserve">.</w:t>
       </w:r>
     </w:p>
     <w:p>
@@ -1576,7 +1607,7 @@
             <w:pPr>
               <w:spacing w:after="0"/>
             </w:pPr>
-            <w:hyperlink w:history="1" r:id="rIddbi7awqxqkdym-nlntdhg">
+            <w:hyperlink w:history="1" r:id="rIdurs3syxuh1c_do2hakdt0">
               <w:r>
                 <w:rPr>
                   <w:rStyle w:val="Hyperlink"/>
@@ -5521,7 +5552,17 @@
     </w:p>
     <w:p>
       <w:r>
-        <w:t xml:space="preserve">If you choose a time outside the available time, Balance explains why and offers </w:t>
+        <w:t xml:space="preserve">If there is no free time in the 7 days from the chosen start, the form says </w:t>
+      </w:r>
+      <w:r>
+        <w:rPr>
+          <w:i/>
+          <w:iCs/>
+        </w:rPr>
+        <w:t xml:space="preserve">No free time in the 7 days from …</w:t>
+      </w:r>
+      <w:r>
+        <w:t xml:space="preserve"> and asks you to add availability on Today first. If you choose a time outside the available time, Balance explains why and offers </w:t>
       </w:r>
       <w:r>
         <w:rPr>
@@ -9003,7 +9044,23 @@
                 <w:sz w:val="19"/>
                 <w:szCs w:val="19"/>
               </w:rPr>
-              <w:t xml:space="preserve"> records nothing.</w:t>
+              <w:t xml:space="preserve"> records nothing. A task that was part of a confirmed plan (even one later undone) stays in plan history, so it cannot be deleted: use </w:t>
+            </w:r>
+            <w:r>
+              <w:rPr>
+                <w:b/>
+                <w:bCs/>
+                <w:sz w:val="19"/>
+                <w:szCs w:val="19"/>
+              </w:rPr>
+              <w:t xml:space="preserve">Mark as done</w:t>
+            </w:r>
+            <w:r>
+              <w:rPr>
+                <w:sz w:val="19"/>
+                <w:szCs w:val="19"/>
+              </w:rPr>
+              <w:t xml:space="preserve"> instead.</w:t>
             </w:r>
           </w:p>
         </w:tc>
@@ -13043,6 +13100,177 @@
                 <w:szCs w:val="19"/>
               </w:rPr>
               <w:t xml:space="preserve"> (step 6.5).</w:t>
+            </w:r>
+          </w:p>
+        </w:tc>
+      </w:tr>
+      <w:tr>
+        <w:trPr>
+          <w:cantSplit/>
+        </w:trPr>
+        <w:tc>
+          <w:tcPr>
+            <w:tcW w:type="dxa" w:w="4953"/>
+            <w:tcBorders>
+              <w:top w:val="single" w:color="D9DBE6" w:sz="4"/>
+              <w:left w:val="single" w:color="D9DBE6" w:sz="4"/>
+              <w:bottom w:val="single" w:color="D9DBE6" w:sz="4"/>
+              <w:right w:val="single" w:color="D9DBE6" w:sz="4"/>
+            </w:tcBorders>
+            <w:shd w:fill="F5F5FA" w:val="clear"/>
+            <w:tcMar>
+              <w:top w:type="dxa" w:w="60"/>
+              <w:left w:type="dxa" w:w="100"/>
+              <w:bottom w:type="dxa" w:w="60"/>
+              <w:right w:type="dxa" w:w="100"/>
+            </w:tcMar>
+          </w:tcPr>
+          <w:p>
+            <w:pPr>
+              <w:spacing w:after="0"/>
+            </w:pPr>
+            <w:r>
+              <w:rPr>
+                <w:i/>
+                <w:iCs/>
+                <w:sz w:val="19"/>
+                <w:szCs w:val="19"/>
+              </w:rPr>
+              <w:t xml:space="preserve">This task is part of your plan history, so it cannot be deleted</w:t>
+            </w:r>
+          </w:p>
+        </w:tc>
+        <w:tc>
+          <w:tcPr>
+            <w:tcW w:type="dxa" w:w="4953"/>
+            <w:tcBorders>
+              <w:top w:val="single" w:color="D9DBE6" w:sz="4"/>
+              <w:left w:val="single" w:color="D9DBE6" w:sz="4"/>
+              <w:bottom w:val="single" w:color="D9DBE6" w:sz="4"/>
+              <w:right w:val="single" w:color="D9DBE6" w:sz="4"/>
+            </w:tcBorders>
+            <w:shd w:fill="F5F5FA" w:val="clear"/>
+            <w:tcMar>
+              <w:top w:type="dxa" w:w="60"/>
+              <w:left w:type="dxa" w:w="100"/>
+              <w:bottom w:type="dxa" w:w="60"/>
+              <w:right w:type="dxa" w:w="100"/>
+            </w:tcMar>
+          </w:tcPr>
+          <w:p>
+            <w:pPr>
+              <w:spacing w:after="0"/>
+            </w:pPr>
+            <w:r>
+              <w:rPr>
+                <w:sz w:val="19"/>
+                <w:szCs w:val="19"/>
+              </w:rPr>
+              <w:t xml:space="preserve">Plan history keeps every task that was part of a confirmed plan. Use </w:t>
+            </w:r>
+            <w:r>
+              <w:rPr>
+                <w:b/>
+                <w:bCs/>
+                <w:sz w:val="19"/>
+                <w:szCs w:val="19"/>
+              </w:rPr>
+              <w:t xml:space="preserve">⋮ → Mark as done</w:t>
+            </w:r>
+            <w:r>
+              <w:rPr>
+                <w:sz w:val="19"/>
+                <w:szCs w:val="19"/>
+              </w:rPr>
+              <w:t xml:space="preserve">; the task stops counting on every day.</w:t>
+            </w:r>
+          </w:p>
+        </w:tc>
+      </w:tr>
+      <w:tr>
+        <w:trPr>
+          <w:cantSplit/>
+        </w:trPr>
+        <w:tc>
+          <w:tcPr>
+            <w:tcW w:type="dxa" w:w="4953"/>
+            <w:tcBorders>
+              <w:top w:val="single" w:color="D9DBE6" w:sz="4"/>
+              <w:left w:val="single" w:color="D9DBE6" w:sz="4"/>
+              <w:bottom w:val="single" w:color="D9DBE6" w:sz="4"/>
+              <w:right w:val="single" w:color="D9DBE6" w:sz="4"/>
+            </w:tcBorders>
+            <w:tcMar>
+              <w:top w:type="dxa" w:w="60"/>
+              <w:left w:type="dxa" w:w="100"/>
+              <w:bottom w:type="dxa" w:w="60"/>
+              <w:right w:type="dxa" w:w="100"/>
+            </w:tcMar>
+          </w:tcPr>
+          <w:p>
+            <w:pPr>
+              <w:spacing w:after="0"/>
+            </w:pPr>
+            <w:r>
+              <w:rPr>
+                <w:i/>
+                <w:iCs/>
+                <w:sz w:val="19"/>
+                <w:szCs w:val="19"/>
+              </w:rPr>
+              <w:t xml:space="preserve">No free time in the 7 days from …</w:t>
+            </w:r>
+            <w:r>
+              <w:rPr>
+                <w:sz w:val="19"/>
+                <w:szCs w:val="19"/>
+              </w:rPr>
+              <w:t xml:space="preserve"> when protecting rest</w:t>
+            </w:r>
+          </w:p>
+        </w:tc>
+        <w:tc>
+          <w:tcPr>
+            <w:tcW w:type="dxa" w:w="4953"/>
+            <w:tcBorders>
+              <w:top w:val="single" w:color="D9DBE6" w:sz="4"/>
+              <w:left w:val="single" w:color="D9DBE6" w:sz="4"/>
+              <w:bottom w:val="single" w:color="D9DBE6" w:sz="4"/>
+              <w:right w:val="single" w:color="D9DBE6" w:sz="4"/>
+            </w:tcBorders>
+            <w:tcMar>
+              <w:top w:type="dxa" w:w="60"/>
+              <w:left w:type="dxa" w:w="100"/>
+              <w:bottom w:type="dxa" w:w="60"/>
+              <w:right w:type="dxa" w:w="100"/>
+            </w:tcMar>
+          </w:tcPr>
+          <w:p>
+            <w:pPr>
+              <w:spacing w:after="0"/>
+            </w:pPr>
+            <w:r>
+              <w:rPr>
+                <w:sz w:val="19"/>
+                <w:szCs w:val="19"/>
+              </w:rPr>
+              <w:t xml:space="preserve">Add availability on </w:t>
+            </w:r>
+            <w:r>
+              <w:rPr>
+                <w:b/>
+                <w:bCs/>
+                <w:sz w:val="19"/>
+                <w:szCs w:val="19"/>
+              </w:rPr>
+              <w:t xml:space="preserve">TODAY</w:t>
+            </w:r>
+            <w:r>
+              <w:rPr>
+                <w:sz w:val="19"/>
+                <w:szCs w:val="19"/>
+              </w:rPr>
+              <w:t xml:space="preserve"> for one of those days first, then add recovery time again.</w:t>
             </w:r>
           </w:p>
         </w:tc>

</xml_diff>